<commit_message>
fix(docx): insertar tablas oficiales de 12 segmentos SLSQP y presupuesto detallado, con mapeo dinamico de tabla IA
</commit_message>
<xml_diff>
--- a/WhatsApp Chat with Ideaton/Plantilla Documento Tecnico Reto 3.01_COMPLETO.docx
+++ b/WhatsApp Chat with Ideaton/Plantilla Documento Tecnico Reto 3.01_COMPLETO.docx
@@ -3856,6 +3856,1801 @@
         <w:br/>
       </w:r>
     </w:p>
+    <w:tbl>
+      <w:tblPr>
+        <w:tblW w:type="auto" w:w="0"/>
+        <w:jc w:val="center"/>
+        <w:tblLook w:firstColumn="1" w:firstRow="1" w:lastColumn="0" w:lastRow="0" w:noHBand="0" w:noVBand="1" w:val="04A0"/>
+      </w:tblPr>
+      <w:tblGrid>
+        <w:gridCol w:w="1805"/>
+        <w:gridCol w:w="1805"/>
+        <w:gridCol w:w="1805"/>
+        <w:gridCol w:w="1805"/>
+        <w:gridCol w:w="1805"/>
+      </w:tblGrid>
+      <w:tr>
+        <w:tc>
+          <w:tcPr>
+            <w:tcW w:type="dxa" w:w="1805"/>
+            <w:shd w:fill="103662"/>
+            <w:tcMar>
+              <w:top w:w="100" w:type="dxa"/>
+              <w:bottom w:w="100" w:type="dxa"/>
+              <w:left w:w="150" w:type="dxa"/>
+              <w:right w:w="150" w:type="dxa"/>
+            </w:tcMar>
+          </w:tcPr>
+          <w:p>
+            <w:pPr>
+              <w:jc w:val="center"/>
+            </w:pPr>
+            <w:r>
+              <w:rPr>
+                <w:rFonts w:ascii="Arial" w:hAnsi="Arial"/>
+                <w:b/>
+                <w:i w:val="0"/>
+                <w:color w:val="FFFFFF"/>
+                <w:sz w:val="17"/>
+              </w:rPr>
+              <w:t>Código</w:t>
+            </w:r>
+          </w:p>
+        </w:tc>
+        <w:tc>
+          <w:tcPr>
+            <w:tcW w:type="dxa" w:w="1805"/>
+            <w:shd w:fill="103662"/>
+            <w:tcMar>
+              <w:top w:w="100" w:type="dxa"/>
+              <w:bottom w:w="100" w:type="dxa"/>
+              <w:left w:w="150" w:type="dxa"/>
+              <w:right w:w="150" w:type="dxa"/>
+            </w:tcMar>
+          </w:tcPr>
+          <w:p>
+            <w:pPr>
+              <w:jc w:val="center"/>
+            </w:pPr>
+            <w:r>
+              <w:rPr>
+                <w:rFonts w:ascii="Arial" w:hAnsi="Arial"/>
+                <w:b/>
+                <w:i w:val="0"/>
+                <w:color w:val="FFFFFF"/>
+                <w:sz w:val="17"/>
+              </w:rPr>
+              <w:t>Nombre del Segmento</w:t>
+            </w:r>
+          </w:p>
+        </w:tc>
+        <w:tc>
+          <w:tcPr>
+            <w:tcW w:type="dxa" w:w="1805"/>
+            <w:shd w:fill="103662"/>
+            <w:tcMar>
+              <w:top w:w="100" w:type="dxa"/>
+              <w:bottom w:w="100" w:type="dxa"/>
+              <w:left w:w="150" w:type="dxa"/>
+              <w:right w:w="150" w:type="dxa"/>
+            </w:tcMar>
+          </w:tcPr>
+          <w:p>
+            <w:pPr>
+              <w:jc w:val="center"/>
+            </w:pPr>
+            <w:r>
+              <w:rPr>
+                <w:rFonts w:ascii="Arial" w:hAnsi="Arial"/>
+                <w:b/>
+                <w:i w:val="0"/>
+                <w:color w:val="FFFFFF"/>
+                <w:sz w:val="17"/>
+              </w:rPr>
+              <w:t>Sector del Campus</w:t>
+            </w:r>
+          </w:p>
+        </w:tc>
+        <w:tc>
+          <w:tcPr>
+            <w:tcW w:type="dxa" w:w="1805"/>
+            <w:shd w:fill="103662"/>
+            <w:tcMar>
+              <w:top w:w="100" w:type="dxa"/>
+              <w:bottom w:w="100" w:type="dxa"/>
+              <w:left w:w="150" w:type="dxa"/>
+              <w:right w:w="150" w:type="dxa"/>
+            </w:tcMar>
+          </w:tcPr>
+          <w:p>
+            <w:pPr>
+              <w:jc w:val="center"/>
+            </w:pPr>
+            <w:r>
+              <w:rPr>
+                <w:rFonts w:ascii="Arial" w:hAnsi="Arial"/>
+                <w:b/>
+                <w:i w:val="0"/>
+                <w:color w:val="FFFFFF"/>
+                <w:sz w:val="17"/>
+              </w:rPr>
+              <w:t>Longitud</w:t>
+            </w:r>
+          </w:p>
+        </w:tc>
+        <w:tc>
+          <w:tcPr>
+            <w:tcW w:type="dxa" w:w="1805"/>
+            <w:shd w:fill="103662"/>
+            <w:tcMar>
+              <w:top w:w="100" w:type="dxa"/>
+              <w:bottom w:w="100" w:type="dxa"/>
+              <w:left w:w="150" w:type="dxa"/>
+              <w:right w:w="150" w:type="dxa"/>
+            </w:tcMar>
+          </w:tcPr>
+          <w:p>
+            <w:pPr>
+              <w:jc w:val="center"/>
+            </w:pPr>
+            <w:r>
+              <w:rPr>
+                <w:rFonts w:ascii="Arial" w:hAnsi="Arial"/>
+                <w:b/>
+                <w:i w:val="0"/>
+                <w:color w:val="FFFFFF"/>
+                <w:sz w:val="17"/>
+              </w:rPr>
+              <w:t>Estratos y Especies</w:t>
+            </w:r>
+          </w:p>
+        </w:tc>
+      </w:tr>
+      <w:tr>
+        <w:tc>
+          <w:tcPr>
+            <w:tcW w:type="dxa" w:w="1805"/>
+            <w:shd w:fill="F7F9FB"/>
+            <w:tcMar>
+              <w:top w:w="100" w:type="dxa"/>
+              <w:bottom w:w="100" w:type="dxa"/>
+              <w:left w:w="150" w:type="dxa"/>
+              <w:right w:w="150" w:type="dxa"/>
+            </w:tcMar>
+          </w:tcPr>
+          <w:p>
+            <w:pPr>
+              <w:jc w:val="center"/>
+            </w:pPr>
+            <w:r>
+              <w:rPr>
+                <w:rFonts w:ascii="Arial" w:hAnsi="Arial"/>
+                <w:b/>
+                <w:i w:val="0"/>
+                <w:color w:val="000000"/>
+                <w:sz w:val="16"/>
+              </w:rPr>
+              <w:t>CV-01</w:t>
+            </w:r>
+          </w:p>
+        </w:tc>
+        <w:tc>
+          <w:tcPr>
+            <w:tcW w:type="dxa" w:w="1805"/>
+            <w:shd w:fill="F7F9FB"/>
+            <w:tcMar>
+              <w:top w:w="100" w:type="dxa"/>
+              <w:bottom w:w="100" w:type="dxa"/>
+              <w:left w:w="150" w:type="dxa"/>
+              <w:right w:w="150" w:type="dxa"/>
+            </w:tcMar>
+          </w:tcPr>
+          <w:p>
+            <w:pPr>
+              <w:jc w:val="left"/>
+            </w:pPr>
+            <w:r>
+              <w:rPr>
+                <w:rFonts w:ascii="Arial" w:hAnsi="Arial"/>
+                <w:b w:val="0"/>
+                <w:i w:val="0"/>
+                <w:color w:val="000000"/>
+                <w:sz w:val="16"/>
+              </w:rPr>
+              <w:t>Cerca Sur Las Multis - Canal Maestro</w:t>
+            </w:r>
+          </w:p>
+        </w:tc>
+        <w:tc>
+          <w:tcPr>
+            <w:tcW w:type="dxa" w:w="1805"/>
+            <w:shd w:fill="F7F9FB"/>
+            <w:tcMar>
+              <w:top w:w="100" w:type="dxa"/>
+              <w:bottom w:w="100" w:type="dxa"/>
+              <w:left w:w="150" w:type="dxa"/>
+              <w:right w:w="150" w:type="dxa"/>
+            </w:tcMar>
+          </w:tcPr>
+          <w:p>
+            <w:pPr>
+              <w:jc w:val="left"/>
+            </w:pPr>
+            <w:r>
+              <w:rPr>
+                <w:rFonts w:ascii="Arial" w:hAnsi="Arial"/>
+                <w:b w:val="0"/>
+                <w:i w:val="0"/>
+                <w:color w:val="000000"/>
+                <w:sz w:val="16"/>
+              </w:rPr>
+              <w:t>Sector Sur (Las Multis)</w:t>
+            </w:r>
+          </w:p>
+        </w:tc>
+        <w:tc>
+          <w:tcPr>
+            <w:tcW w:type="dxa" w:w="1805"/>
+            <w:shd w:fill="F7F9FB"/>
+            <w:tcMar>
+              <w:top w:w="100" w:type="dxa"/>
+              <w:bottom w:w="100" w:type="dxa"/>
+              <w:left w:w="150" w:type="dxa"/>
+              <w:right w:w="150" w:type="dxa"/>
+            </w:tcMar>
+          </w:tcPr>
+          <w:p>
+            <w:pPr>
+              <w:jc w:val="right"/>
+            </w:pPr>
+            <w:r>
+              <w:rPr>
+                <w:rFonts w:ascii="Arial" w:hAnsi="Arial"/>
+                <w:b/>
+                <w:i w:val="0"/>
+                <w:color w:val="000000"/>
+                <w:sz w:val="16"/>
+              </w:rPr>
+              <w:t>120 m</w:t>
+            </w:r>
+          </w:p>
+        </w:tc>
+        <w:tc>
+          <w:tcPr>
+            <w:tcW w:type="dxa" w:w="1805"/>
+            <w:shd w:fill="F7F9FB"/>
+            <w:tcMar>
+              <w:top w:w="100" w:type="dxa"/>
+              <w:bottom w:w="100" w:type="dxa"/>
+              <w:left w:w="150" w:type="dxa"/>
+              <w:right w:w="150" w:type="dxa"/>
+            </w:tcMar>
+          </w:tcPr>
+          <w:p>
+            <w:pPr>
+              <w:jc w:val="left"/>
+            </w:pPr>
+            <w:r>
+              <w:rPr>
+                <w:rFonts w:ascii="Arial" w:hAnsi="Arial"/>
+                <w:b w:val="0"/>
+                <w:i w:val="0"/>
+                <w:color w:val="000000"/>
+                <w:sz w:val="16"/>
+              </w:rPr>
+              <w:t>Molle + Arrayán/Cedrón + Hierba Luisa</w:t>
+            </w:r>
+          </w:p>
+        </w:tc>
+      </w:tr>
+      <w:tr>
+        <w:tc>
+          <w:tcPr>
+            <w:tcW w:type="dxa" w:w="1805"/>
+            <w:shd w:fill="FFFFFF"/>
+            <w:tcMar>
+              <w:top w:w="100" w:type="dxa"/>
+              <w:bottom w:w="100" w:type="dxa"/>
+              <w:left w:w="150" w:type="dxa"/>
+              <w:right w:w="150" w:type="dxa"/>
+            </w:tcMar>
+          </w:tcPr>
+          <w:p>
+            <w:pPr>
+              <w:jc w:val="center"/>
+            </w:pPr>
+            <w:r>
+              <w:rPr>
+                <w:rFonts w:ascii="Arial" w:hAnsi="Arial"/>
+                <w:b/>
+                <w:i w:val="0"/>
+                <w:color w:val="000000"/>
+                <w:sz w:val="16"/>
+              </w:rPr>
+              <w:t>CV-02</w:t>
+            </w:r>
+          </w:p>
+        </w:tc>
+        <w:tc>
+          <w:tcPr>
+            <w:tcW w:type="dxa" w:w="1805"/>
+            <w:shd w:fill="FFFFFF"/>
+            <w:tcMar>
+              <w:top w:w="100" w:type="dxa"/>
+              <w:bottom w:w="100" w:type="dxa"/>
+              <w:left w:w="150" w:type="dxa"/>
+              <w:right w:w="150" w:type="dxa"/>
+            </w:tcMar>
+          </w:tcPr>
+          <w:p>
+            <w:pPr>
+              <w:jc w:val="left"/>
+            </w:pPr>
+            <w:r>
+              <w:rPr>
+                <w:rFonts w:ascii="Arial" w:hAnsi="Arial"/>
+                <w:b w:val="0"/>
+                <w:i w:val="0"/>
+                <w:color w:val="000000"/>
+                <w:sz w:val="16"/>
+              </w:rPr>
+              <w:t>Cerca Oeste Las Multis - Concha Acústica</w:t>
+            </w:r>
+          </w:p>
+        </w:tc>
+        <w:tc>
+          <w:tcPr>
+            <w:tcW w:type="dxa" w:w="1805"/>
+            <w:shd w:fill="FFFFFF"/>
+            <w:tcMar>
+              <w:top w:w="100" w:type="dxa"/>
+              <w:bottom w:w="100" w:type="dxa"/>
+              <w:left w:w="150" w:type="dxa"/>
+              <w:right w:w="150" w:type="dxa"/>
+            </w:tcMar>
+          </w:tcPr>
+          <w:p>
+            <w:pPr>
+              <w:jc w:val="left"/>
+            </w:pPr>
+            <w:r>
+              <w:rPr>
+                <w:rFonts w:ascii="Arial" w:hAnsi="Arial"/>
+                <w:b w:val="0"/>
+                <w:i w:val="0"/>
+                <w:color w:val="000000"/>
+                <w:sz w:val="16"/>
+              </w:rPr>
+              <w:t>Sector Sur (Las Multis)</w:t>
+            </w:r>
+          </w:p>
+        </w:tc>
+        <w:tc>
+          <w:tcPr>
+            <w:tcW w:type="dxa" w:w="1805"/>
+            <w:shd w:fill="FFFFFF"/>
+            <w:tcMar>
+              <w:top w:w="100" w:type="dxa"/>
+              <w:bottom w:w="100" w:type="dxa"/>
+              <w:left w:w="150" w:type="dxa"/>
+              <w:right w:w="150" w:type="dxa"/>
+            </w:tcMar>
+          </w:tcPr>
+          <w:p>
+            <w:pPr>
+              <w:jc w:val="right"/>
+            </w:pPr>
+            <w:r>
+              <w:rPr>
+                <w:rFonts w:ascii="Arial" w:hAnsi="Arial"/>
+                <w:b/>
+                <w:i w:val="0"/>
+                <w:color w:val="000000"/>
+                <w:sz w:val="16"/>
+              </w:rPr>
+              <w:t>90 m</w:t>
+            </w:r>
+          </w:p>
+        </w:tc>
+        <w:tc>
+          <w:tcPr>
+            <w:tcW w:type="dxa" w:w="1805"/>
+            <w:shd w:fill="FFFFFF"/>
+            <w:tcMar>
+              <w:top w:w="100" w:type="dxa"/>
+              <w:bottom w:w="100" w:type="dxa"/>
+              <w:left w:w="150" w:type="dxa"/>
+              <w:right w:w="150" w:type="dxa"/>
+            </w:tcMar>
+          </w:tcPr>
+          <w:p>
+            <w:pPr>
+              <w:jc w:val="left"/>
+            </w:pPr>
+            <w:r>
+              <w:rPr>
+                <w:rFonts w:ascii="Arial" w:hAnsi="Arial"/>
+                <w:b w:val="0"/>
+                <w:i w:val="0"/>
+                <w:color w:val="000000"/>
+                <w:sz w:val="16"/>
+              </w:rPr>
+              <w:t>Molle + Arrayán/Cedrón + Hierba Luisa</w:t>
+            </w:r>
+          </w:p>
+        </w:tc>
+      </w:tr>
+      <w:tr>
+        <w:tc>
+          <w:tcPr>
+            <w:tcW w:type="dxa" w:w="1805"/>
+            <w:shd w:fill="F7F9FB"/>
+            <w:tcMar>
+              <w:top w:w="100" w:type="dxa"/>
+              <w:bottom w:w="100" w:type="dxa"/>
+              <w:left w:w="150" w:type="dxa"/>
+              <w:right w:w="150" w:type="dxa"/>
+            </w:tcMar>
+          </w:tcPr>
+          <w:p>
+            <w:pPr>
+              <w:jc w:val="center"/>
+            </w:pPr>
+            <w:r>
+              <w:rPr>
+                <w:rFonts w:ascii="Arial" w:hAnsi="Arial"/>
+                <w:b/>
+                <w:i w:val="0"/>
+                <w:color w:val="000000"/>
+                <w:sz w:val="16"/>
+              </w:rPr>
+              <w:t>CV-03</w:t>
+            </w:r>
+          </w:p>
+        </w:tc>
+        <w:tc>
+          <w:tcPr>
+            <w:tcW w:type="dxa" w:w="1805"/>
+            <w:shd w:fill="F7F9FB"/>
+            <w:tcMar>
+              <w:top w:w="100" w:type="dxa"/>
+              <w:bottom w:w="100" w:type="dxa"/>
+              <w:left w:w="150" w:type="dxa"/>
+              <w:right w:w="150" w:type="dxa"/>
+            </w:tcMar>
+          </w:tcPr>
+          <w:p>
+            <w:pPr>
+              <w:jc w:val="left"/>
+            </w:pPr>
+            <w:r>
+              <w:rPr>
+                <w:rFonts w:ascii="Arial" w:hAnsi="Arial"/>
+                <w:b w:val="0"/>
+                <w:i w:val="0"/>
+                <w:color w:val="000000"/>
+                <w:sz w:val="16"/>
+              </w:rPr>
+              <w:t>Cerca Sur Las Pats - Límite Acequia</w:t>
+            </w:r>
+          </w:p>
+        </w:tc>
+        <w:tc>
+          <w:tcPr>
+            <w:tcW w:type="dxa" w:w="1805"/>
+            <w:shd w:fill="F7F9FB"/>
+            <w:tcMar>
+              <w:top w:w="100" w:type="dxa"/>
+              <w:bottom w:w="100" w:type="dxa"/>
+              <w:left w:w="150" w:type="dxa"/>
+              <w:right w:w="150" w:type="dxa"/>
+            </w:tcMar>
+          </w:tcPr>
+          <w:p>
+            <w:pPr>
+              <w:jc w:val="left"/>
+            </w:pPr>
+            <w:r>
+              <w:rPr>
+                <w:rFonts w:ascii="Arial" w:hAnsi="Arial"/>
+                <w:b w:val="0"/>
+                <w:i w:val="0"/>
+                <w:color w:val="000000"/>
+                <w:sz w:val="16"/>
+              </w:rPr>
+              <w:t>Sector Sur (Las Pats)</w:t>
+            </w:r>
+          </w:p>
+        </w:tc>
+        <w:tc>
+          <w:tcPr>
+            <w:tcW w:type="dxa" w:w="1805"/>
+            <w:shd w:fill="F7F9FB"/>
+            <w:tcMar>
+              <w:top w:w="100" w:type="dxa"/>
+              <w:bottom w:w="100" w:type="dxa"/>
+              <w:left w:w="150" w:type="dxa"/>
+              <w:right w:w="150" w:type="dxa"/>
+            </w:tcMar>
+          </w:tcPr>
+          <w:p>
+            <w:pPr>
+              <w:jc w:val="right"/>
+            </w:pPr>
+            <w:r>
+              <w:rPr>
+                <w:rFonts w:ascii="Arial" w:hAnsi="Arial"/>
+                <w:b/>
+                <w:i w:val="0"/>
+                <w:color w:val="000000"/>
+                <w:sz w:val="16"/>
+              </w:rPr>
+              <w:t>80 m</w:t>
+            </w:r>
+          </w:p>
+        </w:tc>
+        <w:tc>
+          <w:tcPr>
+            <w:tcW w:type="dxa" w:w="1805"/>
+            <w:shd w:fill="F7F9FB"/>
+            <w:tcMar>
+              <w:top w:w="100" w:type="dxa"/>
+              <w:bottom w:w="100" w:type="dxa"/>
+              <w:left w:w="150" w:type="dxa"/>
+              <w:right w:w="150" w:type="dxa"/>
+            </w:tcMar>
+          </w:tcPr>
+          <w:p>
+            <w:pPr>
+              <w:jc w:val="left"/>
+            </w:pPr>
+            <w:r>
+              <w:rPr>
+                <w:rFonts w:ascii="Arial" w:hAnsi="Arial"/>
+                <w:b w:val="0"/>
+                <w:i w:val="0"/>
+                <w:color w:val="000000"/>
+                <w:sz w:val="16"/>
+              </w:rPr>
+              <w:t>Molle + Arrayán/Huacatay + Hierba Luisa</w:t>
+            </w:r>
+          </w:p>
+        </w:tc>
+      </w:tr>
+      <w:tr>
+        <w:tc>
+          <w:tcPr>
+            <w:tcW w:type="dxa" w:w="1805"/>
+            <w:shd w:fill="FFFFFF"/>
+            <w:tcMar>
+              <w:top w:w="100" w:type="dxa"/>
+              <w:bottom w:w="100" w:type="dxa"/>
+              <w:left w:w="150" w:type="dxa"/>
+              <w:right w:w="150" w:type="dxa"/>
+            </w:tcMar>
+          </w:tcPr>
+          <w:p>
+            <w:pPr>
+              <w:jc w:val="center"/>
+            </w:pPr>
+            <w:r>
+              <w:rPr>
+                <w:rFonts w:ascii="Arial" w:hAnsi="Arial"/>
+                <w:b/>
+                <w:i w:val="0"/>
+                <w:color w:val="000000"/>
+                <w:sz w:val="16"/>
+              </w:rPr>
+              <w:t>CV-04</w:t>
+            </w:r>
+          </w:p>
+        </w:tc>
+        <w:tc>
+          <w:tcPr>
+            <w:tcW w:type="dxa" w:w="1805"/>
+            <w:shd w:fill="FFFFFF"/>
+            <w:tcMar>
+              <w:top w:w="100" w:type="dxa"/>
+              <w:bottom w:w="100" w:type="dxa"/>
+              <w:left w:w="150" w:type="dxa"/>
+              <w:right w:w="150" w:type="dxa"/>
+            </w:tcMar>
+          </w:tcPr>
+          <w:p>
+            <w:pPr>
+              <w:jc w:val="left"/>
+            </w:pPr>
+            <w:r>
+              <w:rPr>
+                <w:rFonts w:ascii="Arial" w:hAnsi="Arial"/>
+                <w:b w:val="0"/>
+                <w:i w:val="0"/>
+                <w:color w:val="000000"/>
+                <w:sz w:val="16"/>
+              </w:rPr>
+              <w:t>Cerca Este Las Pats - Vía Acceso</w:t>
+            </w:r>
+          </w:p>
+        </w:tc>
+        <w:tc>
+          <w:tcPr>
+            <w:tcW w:type="dxa" w:w="1805"/>
+            <w:shd w:fill="FFFFFF"/>
+            <w:tcMar>
+              <w:top w:w="100" w:type="dxa"/>
+              <w:bottom w:w="100" w:type="dxa"/>
+              <w:left w:w="150" w:type="dxa"/>
+              <w:right w:w="150" w:type="dxa"/>
+            </w:tcMar>
+          </w:tcPr>
+          <w:p>
+            <w:pPr>
+              <w:jc w:val="left"/>
+            </w:pPr>
+            <w:r>
+              <w:rPr>
+                <w:rFonts w:ascii="Arial" w:hAnsi="Arial"/>
+                <w:b w:val="0"/>
+                <w:i w:val="0"/>
+                <w:color w:val="000000"/>
+                <w:sz w:val="16"/>
+              </w:rPr>
+              <w:t>Sector Sur (Las Pats)</w:t>
+            </w:r>
+          </w:p>
+        </w:tc>
+        <w:tc>
+          <w:tcPr>
+            <w:tcW w:type="dxa" w:w="1805"/>
+            <w:shd w:fill="FFFFFF"/>
+            <w:tcMar>
+              <w:top w:w="100" w:type="dxa"/>
+              <w:bottom w:w="100" w:type="dxa"/>
+              <w:left w:w="150" w:type="dxa"/>
+              <w:right w:w="150" w:type="dxa"/>
+            </w:tcMar>
+          </w:tcPr>
+          <w:p>
+            <w:pPr>
+              <w:jc w:val="right"/>
+            </w:pPr>
+            <w:r>
+              <w:rPr>
+                <w:rFonts w:ascii="Arial" w:hAnsi="Arial"/>
+                <w:b/>
+                <w:i w:val="0"/>
+                <w:color w:val="000000"/>
+                <w:sz w:val="16"/>
+              </w:rPr>
+              <w:t>90 m</w:t>
+            </w:r>
+          </w:p>
+        </w:tc>
+        <w:tc>
+          <w:tcPr>
+            <w:tcW w:type="dxa" w:w="1805"/>
+            <w:shd w:fill="FFFFFF"/>
+            <w:tcMar>
+              <w:top w:w="100" w:type="dxa"/>
+              <w:bottom w:w="100" w:type="dxa"/>
+              <w:left w:w="150" w:type="dxa"/>
+              <w:right w:w="150" w:type="dxa"/>
+            </w:tcMar>
+          </w:tcPr>
+          <w:p>
+            <w:pPr>
+              <w:jc w:val="left"/>
+            </w:pPr>
+            <w:r>
+              <w:rPr>
+                <w:rFonts w:ascii="Arial" w:hAnsi="Arial"/>
+                <w:b w:val="0"/>
+                <w:i w:val="0"/>
+                <w:color w:val="000000"/>
+                <w:sz w:val="16"/>
+              </w:rPr>
+              <w:t>Molle + Arrayán/Huacatay + Hierba Luisa</w:t>
+            </w:r>
+          </w:p>
+        </w:tc>
+      </w:tr>
+      <w:tr>
+        <w:tc>
+          <w:tcPr>
+            <w:tcW w:type="dxa" w:w="1805"/>
+            <w:shd w:fill="F7F9FB"/>
+            <w:tcMar>
+              <w:top w:w="100" w:type="dxa"/>
+              <w:bottom w:w="100" w:type="dxa"/>
+              <w:left w:w="150" w:type="dxa"/>
+              <w:right w:w="150" w:type="dxa"/>
+            </w:tcMar>
+          </w:tcPr>
+          <w:p>
+            <w:pPr>
+              <w:jc w:val="center"/>
+            </w:pPr>
+            <w:r>
+              <w:rPr>
+                <w:rFonts w:ascii="Arial" w:hAnsi="Arial"/>
+                <w:b/>
+                <w:i w:val="0"/>
+                <w:color w:val="000000"/>
+                <w:sz w:val="16"/>
+              </w:rPr>
+              <w:t>CV-05</w:t>
+            </w:r>
+          </w:p>
+        </w:tc>
+        <w:tc>
+          <w:tcPr>
+            <w:tcW w:type="dxa" w:w="1805"/>
+            <w:shd w:fill="F7F9FB"/>
+            <w:tcMar>
+              <w:top w:w="100" w:type="dxa"/>
+              <w:bottom w:w="100" w:type="dxa"/>
+              <w:left w:w="150" w:type="dxa"/>
+              <w:right w:w="150" w:type="dxa"/>
+            </w:tcMar>
+          </w:tcPr>
+          <w:p>
+            <w:pPr>
+              <w:jc w:val="left"/>
+            </w:pPr>
+            <w:r>
+              <w:rPr>
+                <w:rFonts w:ascii="Arial" w:hAnsi="Arial"/>
+                <w:b w:val="0"/>
+                <w:i w:val="0"/>
+                <w:color w:val="000000"/>
+                <w:sz w:val="16"/>
+              </w:rPr>
+              <w:t>Cerca Central Ingenio - Biblioteca</w:t>
+            </w:r>
+          </w:p>
+        </w:tc>
+        <w:tc>
+          <w:tcPr>
+            <w:tcW w:type="dxa" w:w="1805"/>
+            <w:shd w:fill="F7F9FB"/>
+            <w:tcMar>
+              <w:top w:w="100" w:type="dxa"/>
+              <w:bottom w:w="100" w:type="dxa"/>
+              <w:left w:w="150" w:type="dxa"/>
+              <w:right w:w="150" w:type="dxa"/>
+            </w:tcMar>
+          </w:tcPr>
+          <w:p>
+            <w:pPr>
+              <w:jc w:val="left"/>
+            </w:pPr>
+            <w:r>
+              <w:rPr>
+                <w:rFonts w:ascii="Arial" w:hAnsi="Arial"/>
+                <w:b w:val="0"/>
+                <w:i w:val="0"/>
+                <w:color w:val="000000"/>
+                <w:sz w:val="16"/>
+              </w:rPr>
+              <w:t>Sector Central (Ingenio)</w:t>
+            </w:r>
+          </w:p>
+        </w:tc>
+        <w:tc>
+          <w:tcPr>
+            <w:tcW w:type="dxa" w:w="1805"/>
+            <w:shd w:fill="F7F9FB"/>
+            <w:tcMar>
+              <w:top w:w="100" w:type="dxa"/>
+              <w:bottom w:w="100" w:type="dxa"/>
+              <w:left w:w="150" w:type="dxa"/>
+              <w:right w:w="150" w:type="dxa"/>
+            </w:tcMar>
+          </w:tcPr>
+          <w:p>
+            <w:pPr>
+              <w:jc w:val="right"/>
+            </w:pPr>
+            <w:r>
+              <w:rPr>
+                <w:rFonts w:ascii="Arial" w:hAnsi="Arial"/>
+                <w:b/>
+                <w:i w:val="0"/>
+                <w:color w:val="000000"/>
+                <w:sz w:val="16"/>
+              </w:rPr>
+              <w:t>85 m</w:t>
+            </w:r>
+          </w:p>
+        </w:tc>
+        <w:tc>
+          <w:tcPr>
+            <w:tcW w:type="dxa" w:w="1805"/>
+            <w:shd w:fill="F7F9FB"/>
+            <w:tcMar>
+              <w:top w:w="100" w:type="dxa"/>
+              <w:bottom w:w="100" w:type="dxa"/>
+              <w:left w:w="150" w:type="dxa"/>
+              <w:right w:w="150" w:type="dxa"/>
+            </w:tcMar>
+          </w:tcPr>
+          <w:p>
+            <w:pPr>
+              <w:jc w:val="left"/>
+            </w:pPr>
+            <w:r>
+              <w:rPr>
+                <w:rFonts w:ascii="Arial" w:hAnsi="Arial"/>
+                <w:b w:val="0"/>
+                <w:i w:val="0"/>
+                <w:color w:val="000000"/>
+                <w:sz w:val="16"/>
+              </w:rPr>
+              <w:t>Molle + Arrayán + Hierba Luisa</w:t>
+            </w:r>
+          </w:p>
+        </w:tc>
+      </w:tr>
+      <w:tr>
+        <w:tc>
+          <w:tcPr>
+            <w:tcW w:type="dxa" w:w="1805"/>
+            <w:shd w:fill="FFFFFF"/>
+            <w:tcMar>
+              <w:top w:w="100" w:type="dxa"/>
+              <w:bottom w:w="100" w:type="dxa"/>
+              <w:left w:w="150" w:type="dxa"/>
+              <w:right w:w="150" w:type="dxa"/>
+            </w:tcMar>
+          </w:tcPr>
+          <w:p>
+            <w:pPr>
+              <w:jc w:val="center"/>
+            </w:pPr>
+            <w:r>
+              <w:rPr>
+                <w:rFonts w:ascii="Arial" w:hAnsi="Arial"/>
+                <w:b/>
+                <w:i w:val="0"/>
+                <w:color w:val="000000"/>
+                <w:sz w:val="16"/>
+              </w:rPr>
+              <w:t>CV-06</w:t>
+            </w:r>
+          </w:p>
+        </w:tc>
+        <w:tc>
+          <w:tcPr>
+            <w:tcW w:type="dxa" w:w="1805"/>
+            <w:shd w:fill="FFFFFF"/>
+            <w:tcMar>
+              <w:top w:w="100" w:type="dxa"/>
+              <w:bottom w:w="100" w:type="dxa"/>
+              <w:left w:w="150" w:type="dxa"/>
+              <w:right w:w="150" w:type="dxa"/>
+            </w:tcMar>
+          </w:tcPr>
+          <w:p>
+            <w:pPr>
+              <w:jc w:val="left"/>
+            </w:pPr>
+            <w:r>
+              <w:rPr>
+                <w:rFonts w:ascii="Arial" w:hAnsi="Arial"/>
+                <w:b w:val="0"/>
+                <w:i w:val="0"/>
+                <w:color w:val="000000"/>
+                <w:sz w:val="16"/>
+              </w:rPr>
+              <w:t>Cerca Central Plaza Mikuna - Aulas</w:t>
+            </w:r>
+          </w:p>
+        </w:tc>
+        <w:tc>
+          <w:tcPr>
+            <w:tcW w:type="dxa" w:w="1805"/>
+            <w:shd w:fill="FFFFFF"/>
+            <w:tcMar>
+              <w:top w:w="100" w:type="dxa"/>
+              <w:bottom w:w="100" w:type="dxa"/>
+              <w:left w:w="150" w:type="dxa"/>
+              <w:right w:w="150" w:type="dxa"/>
+            </w:tcMar>
+          </w:tcPr>
+          <w:p>
+            <w:pPr>
+              <w:jc w:val="left"/>
+            </w:pPr>
+            <w:r>
+              <w:rPr>
+                <w:rFonts w:ascii="Arial" w:hAnsi="Arial"/>
+                <w:b w:val="0"/>
+                <w:i w:val="0"/>
+                <w:color w:val="000000"/>
+                <w:sz w:val="16"/>
+              </w:rPr>
+              <w:t>Sector Central (Plaza Mikuna)</w:t>
+            </w:r>
+          </w:p>
+        </w:tc>
+        <w:tc>
+          <w:tcPr>
+            <w:tcW w:type="dxa" w:w="1805"/>
+            <w:shd w:fill="FFFFFF"/>
+            <w:tcMar>
+              <w:top w:w="100" w:type="dxa"/>
+              <w:bottom w:w="100" w:type="dxa"/>
+              <w:left w:w="150" w:type="dxa"/>
+              <w:right w:w="150" w:type="dxa"/>
+            </w:tcMar>
+          </w:tcPr>
+          <w:p>
+            <w:pPr>
+              <w:jc w:val="right"/>
+            </w:pPr>
+            <w:r>
+              <w:rPr>
+                <w:rFonts w:ascii="Arial" w:hAnsi="Arial"/>
+                <w:b/>
+                <w:i w:val="0"/>
+                <w:color w:val="000000"/>
+                <w:sz w:val="16"/>
+              </w:rPr>
+              <w:t>95 m</w:t>
+            </w:r>
+          </w:p>
+        </w:tc>
+        <w:tc>
+          <w:tcPr>
+            <w:tcW w:type="dxa" w:w="1805"/>
+            <w:shd w:fill="FFFFFF"/>
+            <w:tcMar>
+              <w:top w:w="100" w:type="dxa"/>
+              <w:bottom w:w="100" w:type="dxa"/>
+              <w:left w:w="150" w:type="dxa"/>
+              <w:right w:w="150" w:type="dxa"/>
+            </w:tcMar>
+          </w:tcPr>
+          <w:p>
+            <w:pPr>
+              <w:jc w:val="left"/>
+            </w:pPr>
+            <w:r>
+              <w:rPr>
+                <w:rFonts w:ascii="Arial" w:hAnsi="Arial"/>
+                <w:b w:val="0"/>
+                <w:i w:val="0"/>
+                <w:color w:val="000000"/>
+                <w:sz w:val="16"/>
+              </w:rPr>
+              <w:t>Molle + Arrayán + Hierba Luisa</w:t>
+            </w:r>
+          </w:p>
+        </w:tc>
+      </w:tr>
+      <w:tr>
+        <w:tc>
+          <w:tcPr>
+            <w:tcW w:type="dxa" w:w="1805"/>
+            <w:shd w:fill="F7F9FB"/>
+            <w:tcMar>
+              <w:top w:w="100" w:type="dxa"/>
+              <w:bottom w:w="100" w:type="dxa"/>
+              <w:left w:w="150" w:type="dxa"/>
+              <w:right w:w="150" w:type="dxa"/>
+            </w:tcMar>
+          </w:tcPr>
+          <w:p>
+            <w:pPr>
+              <w:jc w:val="center"/>
+            </w:pPr>
+            <w:r>
+              <w:rPr>
+                <w:rFonts w:ascii="Arial" w:hAnsi="Arial"/>
+                <w:b/>
+                <w:i w:val="0"/>
+                <w:color w:val="000000"/>
+                <w:sz w:val="16"/>
+              </w:rPr>
+              <w:t>CV-07</w:t>
+            </w:r>
+          </w:p>
+        </w:tc>
+        <w:tc>
+          <w:tcPr>
+            <w:tcW w:type="dxa" w:w="1805"/>
+            <w:shd w:fill="F7F9FB"/>
+            <w:tcMar>
+              <w:top w:w="100" w:type="dxa"/>
+              <w:bottom w:w="100" w:type="dxa"/>
+              <w:left w:w="150" w:type="dxa"/>
+              <w:right w:w="150" w:type="dxa"/>
+            </w:tcMar>
+          </w:tcPr>
+          <w:p>
+            <w:pPr>
+              <w:jc w:val="left"/>
+            </w:pPr>
+            <w:r>
+              <w:rPr>
+                <w:rFonts w:ascii="Arial" w:hAnsi="Arial"/>
+                <w:b w:val="0"/>
+                <w:i w:val="0"/>
+                <w:color w:val="000000"/>
+                <w:sz w:val="16"/>
+              </w:rPr>
+              <w:t>Cerca San José - Sala Capitular y Parada</w:t>
+            </w:r>
+          </w:p>
+        </w:tc>
+        <w:tc>
+          <w:tcPr>
+            <w:tcW w:type="dxa" w:w="1805"/>
+            <w:shd w:fill="F7F9FB"/>
+            <w:tcMar>
+              <w:top w:w="100" w:type="dxa"/>
+              <w:bottom w:w="100" w:type="dxa"/>
+              <w:left w:w="150" w:type="dxa"/>
+              <w:right w:w="150" w:type="dxa"/>
+            </w:tcMar>
+          </w:tcPr>
+          <w:p>
+            <w:pPr>
+              <w:jc w:val="left"/>
+            </w:pPr>
+            <w:r>
+              <w:rPr>
+                <w:rFonts w:ascii="Arial" w:hAnsi="Arial"/>
+                <w:b w:val="0"/>
+                <w:i w:val="0"/>
+                <w:color w:val="000000"/>
+                <w:sz w:val="16"/>
+              </w:rPr>
+              <w:t>Sector Central (San José)</w:t>
+            </w:r>
+          </w:p>
+        </w:tc>
+        <w:tc>
+          <w:tcPr>
+            <w:tcW w:type="dxa" w:w="1805"/>
+            <w:shd w:fill="F7F9FB"/>
+            <w:tcMar>
+              <w:top w:w="100" w:type="dxa"/>
+              <w:bottom w:w="100" w:type="dxa"/>
+              <w:left w:w="150" w:type="dxa"/>
+              <w:right w:w="150" w:type="dxa"/>
+            </w:tcMar>
+          </w:tcPr>
+          <w:p>
+            <w:pPr>
+              <w:jc w:val="right"/>
+            </w:pPr>
+            <w:r>
+              <w:rPr>
+                <w:rFonts w:ascii="Arial" w:hAnsi="Arial"/>
+                <w:b/>
+                <w:i w:val="0"/>
+                <w:color w:val="000000"/>
+                <w:sz w:val="16"/>
+              </w:rPr>
+              <w:t>100 m</w:t>
+            </w:r>
+          </w:p>
+        </w:tc>
+        <w:tc>
+          <w:tcPr>
+            <w:tcW w:type="dxa" w:w="1805"/>
+            <w:shd w:fill="F7F9FB"/>
+            <w:tcMar>
+              <w:top w:w="100" w:type="dxa"/>
+              <w:bottom w:w="100" w:type="dxa"/>
+              <w:left w:w="150" w:type="dxa"/>
+              <w:right w:w="150" w:type="dxa"/>
+            </w:tcMar>
+          </w:tcPr>
+          <w:p>
+            <w:pPr>
+              <w:jc w:val="left"/>
+            </w:pPr>
+            <w:r>
+              <w:rPr>
+                <w:rFonts w:ascii="Arial" w:hAnsi="Arial"/>
+                <w:b w:val="0"/>
+                <w:i w:val="0"/>
+                <w:color w:val="000000"/>
+                <w:sz w:val="16"/>
+              </w:rPr>
+              <w:t>Molle + Arrayán/Cedrón + Hierba Luisa</w:t>
+            </w:r>
+          </w:p>
+        </w:tc>
+      </w:tr>
+      <w:tr>
+        <w:tc>
+          <w:tcPr>
+            <w:tcW w:type="dxa" w:w="1805"/>
+            <w:shd w:fill="FFFFFF"/>
+            <w:tcMar>
+              <w:top w:w="100" w:type="dxa"/>
+              <w:bottom w:w="100" w:type="dxa"/>
+              <w:left w:w="150" w:type="dxa"/>
+              <w:right w:w="150" w:type="dxa"/>
+            </w:tcMar>
+          </w:tcPr>
+          <w:p>
+            <w:pPr>
+              <w:jc w:val="center"/>
+            </w:pPr>
+            <w:r>
+              <w:rPr>
+                <w:rFonts w:ascii="Arial" w:hAnsi="Arial"/>
+                <w:b/>
+                <w:i w:val="0"/>
+                <w:color w:val="000000"/>
+                <w:sz w:val="16"/>
+              </w:rPr>
+              <w:t>CV-08</w:t>
+            </w:r>
+          </w:p>
+        </w:tc>
+        <w:tc>
+          <w:tcPr>
+            <w:tcW w:type="dxa" w:w="1805"/>
+            <w:shd w:fill="FFFFFF"/>
+            <w:tcMar>
+              <w:top w:w="100" w:type="dxa"/>
+              <w:bottom w:w="100" w:type="dxa"/>
+              <w:left w:w="150" w:type="dxa"/>
+              <w:right w:w="150" w:type="dxa"/>
+            </w:tcMar>
+          </w:tcPr>
+          <w:p>
+            <w:pPr>
+              <w:jc w:val="left"/>
+            </w:pPr>
+            <w:r>
+              <w:rPr>
+                <w:rFonts w:ascii="Arial" w:hAnsi="Arial"/>
+                <w:b w:val="0"/>
+                <w:i w:val="0"/>
+                <w:color w:val="000000"/>
+                <w:sz w:val="16"/>
+              </w:rPr>
+              <w:t>Cerca Norte Senescyt - Canal Principal</w:t>
+            </w:r>
+          </w:p>
+        </w:tc>
+        <w:tc>
+          <w:tcPr>
+            <w:tcW w:type="dxa" w:w="1805"/>
+            <w:shd w:fill="FFFFFF"/>
+            <w:tcMar>
+              <w:top w:w="100" w:type="dxa"/>
+              <w:bottom w:w="100" w:type="dxa"/>
+              <w:left w:w="150" w:type="dxa"/>
+              <w:right w:w="150" w:type="dxa"/>
+            </w:tcMar>
+          </w:tcPr>
+          <w:p>
+            <w:pPr>
+              <w:jc w:val="left"/>
+            </w:pPr>
+            <w:r>
+              <w:rPr>
+                <w:rFonts w:ascii="Arial" w:hAnsi="Arial"/>
+                <w:b w:val="0"/>
+                <w:i w:val="0"/>
+                <w:color w:val="000000"/>
+                <w:sz w:val="16"/>
+              </w:rPr>
+              <w:t>Sector Académico Norte</w:t>
+            </w:r>
+          </w:p>
+        </w:tc>
+        <w:tc>
+          <w:tcPr>
+            <w:tcW w:type="dxa" w:w="1805"/>
+            <w:shd w:fill="FFFFFF"/>
+            <w:tcMar>
+              <w:top w:w="100" w:type="dxa"/>
+              <w:bottom w:w="100" w:type="dxa"/>
+              <w:left w:w="150" w:type="dxa"/>
+              <w:right w:w="150" w:type="dxa"/>
+            </w:tcMar>
+          </w:tcPr>
+          <w:p>
+            <w:pPr>
+              <w:jc w:val="right"/>
+            </w:pPr>
+            <w:r>
+              <w:rPr>
+                <w:rFonts w:ascii="Arial" w:hAnsi="Arial"/>
+                <w:b/>
+                <w:i w:val="0"/>
+                <w:color w:val="000000"/>
+                <w:sz w:val="16"/>
+              </w:rPr>
+              <w:t>110 m</w:t>
+            </w:r>
+          </w:p>
+        </w:tc>
+        <w:tc>
+          <w:tcPr>
+            <w:tcW w:type="dxa" w:w="1805"/>
+            <w:shd w:fill="FFFFFF"/>
+            <w:tcMar>
+              <w:top w:w="100" w:type="dxa"/>
+              <w:bottom w:w="100" w:type="dxa"/>
+              <w:left w:w="150" w:type="dxa"/>
+              <w:right w:w="150" w:type="dxa"/>
+            </w:tcMar>
+          </w:tcPr>
+          <w:p>
+            <w:pPr>
+              <w:jc w:val="left"/>
+            </w:pPr>
+            <w:r>
+              <w:rPr>
+                <w:rFonts w:ascii="Arial" w:hAnsi="Arial"/>
+                <w:b w:val="0"/>
+                <w:i w:val="0"/>
+                <w:color w:val="000000"/>
+                <w:sz w:val="16"/>
+              </w:rPr>
+              <w:t>Molle + Arrayán/Romero + Hierba Luisa</w:t>
+            </w:r>
+          </w:p>
+        </w:tc>
+      </w:tr>
+      <w:tr>
+        <w:tc>
+          <w:tcPr>
+            <w:tcW w:type="dxa" w:w="1805"/>
+            <w:shd w:fill="F7F9FB"/>
+            <w:tcMar>
+              <w:top w:w="100" w:type="dxa"/>
+              <w:bottom w:w="100" w:type="dxa"/>
+              <w:left w:w="150" w:type="dxa"/>
+              <w:right w:w="150" w:type="dxa"/>
+            </w:tcMar>
+          </w:tcPr>
+          <w:p>
+            <w:pPr>
+              <w:jc w:val="center"/>
+            </w:pPr>
+            <w:r>
+              <w:rPr>
+                <w:rFonts w:ascii="Arial" w:hAnsi="Arial"/>
+                <w:b/>
+                <w:i w:val="0"/>
+                <w:color w:val="000000"/>
+                <w:sz w:val="16"/>
+              </w:rPr>
+              <w:t>CV-09</w:t>
+            </w:r>
+          </w:p>
+        </w:tc>
+        <w:tc>
+          <w:tcPr>
+            <w:tcW w:type="dxa" w:w="1805"/>
+            <w:shd w:fill="F7F9FB"/>
+            <w:tcMar>
+              <w:top w:w="100" w:type="dxa"/>
+              <w:bottom w:w="100" w:type="dxa"/>
+              <w:left w:w="150" w:type="dxa"/>
+              <w:right w:w="150" w:type="dxa"/>
+            </w:tcMar>
+          </w:tcPr>
+          <w:p>
+            <w:pPr>
+              <w:jc w:val="left"/>
+            </w:pPr>
+            <w:r>
+              <w:rPr>
+                <w:rFonts w:ascii="Arial" w:hAnsi="Arial"/>
+                <w:b w:val="0"/>
+                <w:i w:val="0"/>
+                <w:color w:val="000000"/>
+                <w:sz w:val="16"/>
+              </w:rPr>
+              <w:t>Cerca Norte Residencias Bloques - Canal</w:t>
+            </w:r>
+          </w:p>
+        </w:tc>
+        <w:tc>
+          <w:tcPr>
+            <w:tcW w:type="dxa" w:w="1805"/>
+            <w:shd w:fill="F7F9FB"/>
+            <w:tcMar>
+              <w:top w:w="100" w:type="dxa"/>
+              <w:bottom w:w="100" w:type="dxa"/>
+              <w:left w:w="150" w:type="dxa"/>
+              <w:right w:w="150" w:type="dxa"/>
+            </w:tcMar>
+          </w:tcPr>
+          <w:p>
+            <w:pPr>
+              <w:jc w:val="left"/>
+            </w:pPr>
+            <w:r>
+              <w:rPr>
+                <w:rFonts w:ascii="Arial" w:hAnsi="Arial"/>
+                <w:b w:val="0"/>
+                <w:i w:val="0"/>
+                <w:color w:val="000000"/>
+                <w:sz w:val="16"/>
+              </w:rPr>
+              <w:t>Sector Académico Norte</w:t>
+            </w:r>
+          </w:p>
+        </w:tc>
+        <w:tc>
+          <w:tcPr>
+            <w:tcW w:type="dxa" w:w="1805"/>
+            <w:shd w:fill="F7F9FB"/>
+            <w:tcMar>
+              <w:top w:w="100" w:type="dxa"/>
+              <w:bottom w:w="100" w:type="dxa"/>
+              <w:left w:w="150" w:type="dxa"/>
+              <w:right w:w="150" w:type="dxa"/>
+            </w:tcMar>
+          </w:tcPr>
+          <w:p>
+            <w:pPr>
+              <w:jc w:val="right"/>
+            </w:pPr>
+            <w:r>
+              <w:rPr>
+                <w:rFonts w:ascii="Arial" w:hAnsi="Arial"/>
+                <w:b/>
+                <w:i w:val="0"/>
+                <w:color w:val="000000"/>
+                <w:sz w:val="16"/>
+              </w:rPr>
+              <w:t>110 m</w:t>
+            </w:r>
+          </w:p>
+        </w:tc>
+        <w:tc>
+          <w:tcPr>
+            <w:tcW w:type="dxa" w:w="1805"/>
+            <w:shd w:fill="F7F9FB"/>
+            <w:tcMar>
+              <w:top w:w="100" w:type="dxa"/>
+              <w:bottom w:w="100" w:type="dxa"/>
+              <w:left w:w="150" w:type="dxa"/>
+              <w:right w:w="150" w:type="dxa"/>
+            </w:tcMar>
+          </w:tcPr>
+          <w:p>
+            <w:pPr>
+              <w:jc w:val="left"/>
+            </w:pPr>
+            <w:r>
+              <w:rPr>
+                <w:rFonts w:ascii="Arial" w:hAnsi="Arial"/>
+                <w:b w:val="0"/>
+                <w:i w:val="0"/>
+                <w:color w:val="000000"/>
+                <w:sz w:val="16"/>
+              </w:rPr>
+              <w:t>Molle + Arrayán/Cedrón + Hierba Luisa</w:t>
+            </w:r>
+          </w:p>
+        </w:tc>
+      </w:tr>
+      <w:tr>
+        <w:tc>
+          <w:tcPr>
+            <w:tcW w:type="dxa" w:w="1805"/>
+            <w:shd w:fill="FFFFFF"/>
+            <w:tcMar>
+              <w:top w:w="100" w:type="dxa"/>
+              <w:bottom w:w="100" w:type="dxa"/>
+              <w:left w:w="150" w:type="dxa"/>
+              <w:right w:w="150" w:type="dxa"/>
+            </w:tcMar>
+          </w:tcPr>
+          <w:p>
+            <w:pPr>
+              <w:jc w:val="center"/>
+            </w:pPr>
+            <w:r>
+              <w:rPr>
+                <w:rFonts w:ascii="Arial" w:hAnsi="Arial"/>
+                <w:b/>
+                <w:i w:val="0"/>
+                <w:color w:val="000000"/>
+                <w:sz w:val="16"/>
+              </w:rPr>
+              <w:t>CV-10</w:t>
+            </w:r>
+          </w:p>
+        </w:tc>
+        <w:tc>
+          <w:tcPr>
+            <w:tcW w:type="dxa" w:w="1805"/>
+            <w:shd w:fill="FFFFFF"/>
+            <w:tcMar>
+              <w:top w:w="100" w:type="dxa"/>
+              <w:bottom w:w="100" w:type="dxa"/>
+              <w:left w:w="150" w:type="dxa"/>
+              <w:right w:w="150" w:type="dxa"/>
+            </w:tcMar>
+          </w:tcPr>
+          <w:p>
+            <w:pPr>
+              <w:jc w:val="left"/>
+            </w:pPr>
+            <w:r>
+              <w:rPr>
+                <w:rFonts w:ascii="Arial" w:hAnsi="Arial"/>
+                <w:b w:val="0"/>
+                <w:i w:val="0"/>
+                <w:color w:val="000000"/>
+                <w:sz w:val="16"/>
+              </w:rPr>
+              <w:t>Cerca Este Reservorio - Sendero</w:t>
+            </w:r>
+          </w:p>
+        </w:tc>
+        <w:tc>
+          <w:tcPr>
+            <w:tcW w:type="dxa" w:w="1805"/>
+            <w:shd w:fill="FFFFFF"/>
+            <w:tcMar>
+              <w:top w:w="100" w:type="dxa"/>
+              <w:bottom w:w="100" w:type="dxa"/>
+              <w:left w:w="150" w:type="dxa"/>
+              <w:right w:w="150" w:type="dxa"/>
+            </w:tcMar>
+          </w:tcPr>
+          <w:p>
+            <w:pPr>
+              <w:jc w:val="left"/>
+            </w:pPr>
+            <w:r>
+              <w:rPr>
+                <w:rFonts w:ascii="Arial" w:hAnsi="Arial"/>
+                <w:b w:val="0"/>
+                <w:i w:val="0"/>
+                <w:color w:val="000000"/>
+                <w:sz w:val="16"/>
+              </w:rPr>
+              <w:t>Sector Periferia Este</w:t>
+            </w:r>
+          </w:p>
+        </w:tc>
+        <w:tc>
+          <w:tcPr>
+            <w:tcW w:type="dxa" w:w="1805"/>
+            <w:shd w:fill="FFFFFF"/>
+            <w:tcMar>
+              <w:top w:w="100" w:type="dxa"/>
+              <w:bottom w:w="100" w:type="dxa"/>
+              <w:left w:w="150" w:type="dxa"/>
+              <w:right w:w="150" w:type="dxa"/>
+            </w:tcMar>
+          </w:tcPr>
+          <w:p>
+            <w:pPr>
+              <w:jc w:val="right"/>
+            </w:pPr>
+            <w:r>
+              <w:rPr>
+                <w:rFonts w:ascii="Arial" w:hAnsi="Arial"/>
+                <w:b/>
+                <w:i w:val="0"/>
+                <w:color w:val="000000"/>
+                <w:sz w:val="16"/>
+              </w:rPr>
+              <w:t>70 m</w:t>
+            </w:r>
+          </w:p>
+        </w:tc>
+        <w:tc>
+          <w:tcPr>
+            <w:tcW w:type="dxa" w:w="1805"/>
+            <w:shd w:fill="FFFFFF"/>
+            <w:tcMar>
+              <w:top w:w="100" w:type="dxa"/>
+              <w:bottom w:w="100" w:type="dxa"/>
+              <w:left w:w="150" w:type="dxa"/>
+              <w:right w:w="150" w:type="dxa"/>
+            </w:tcMar>
+          </w:tcPr>
+          <w:p>
+            <w:pPr>
+              <w:jc w:val="left"/>
+            </w:pPr>
+            <w:r>
+              <w:rPr>
+                <w:rFonts w:ascii="Arial" w:hAnsi="Arial"/>
+                <w:b w:val="0"/>
+                <w:i w:val="0"/>
+                <w:color w:val="000000"/>
+                <w:sz w:val="16"/>
+              </w:rPr>
+              <w:t>Molle + Arrayán + Hierba Luisa</w:t>
+            </w:r>
+          </w:p>
+        </w:tc>
+      </w:tr>
+      <w:tr>
+        <w:tc>
+          <w:tcPr>
+            <w:tcW w:type="dxa" w:w="1805"/>
+            <w:shd w:fill="F7F9FB"/>
+            <w:tcMar>
+              <w:top w:w="100" w:type="dxa"/>
+              <w:bottom w:w="100" w:type="dxa"/>
+              <w:left w:w="150" w:type="dxa"/>
+              <w:right w:w="150" w:type="dxa"/>
+            </w:tcMar>
+          </w:tcPr>
+          <w:p>
+            <w:pPr>
+              <w:jc w:val="center"/>
+            </w:pPr>
+            <w:r>
+              <w:rPr>
+                <w:rFonts w:ascii="Arial" w:hAnsi="Arial"/>
+                <w:b/>
+                <w:i w:val="0"/>
+                <w:color w:val="000000"/>
+                <w:sz w:val="16"/>
+              </w:rPr>
+              <w:t>CV-11</w:t>
+            </w:r>
+          </w:p>
+        </w:tc>
+        <w:tc>
+          <w:tcPr>
+            <w:tcW w:type="dxa" w:w="1805"/>
+            <w:shd w:fill="F7F9FB"/>
+            <w:tcMar>
+              <w:top w:w="100" w:type="dxa"/>
+              <w:bottom w:w="100" w:type="dxa"/>
+              <w:left w:w="150" w:type="dxa"/>
+              <w:right w:w="150" w:type="dxa"/>
+            </w:tcMar>
+          </w:tcPr>
+          <w:p>
+            <w:pPr>
+              <w:jc w:val="left"/>
+            </w:pPr>
+            <w:r>
+              <w:rPr>
+                <w:rFonts w:ascii="Arial" w:hAnsi="Arial"/>
+                <w:b w:val="0"/>
+                <w:i w:val="0"/>
+                <w:color w:val="000000"/>
+                <w:sz w:val="16"/>
+              </w:rPr>
+              <w:t>Cerca Complejo Deportivo - Sur Canchas</w:t>
+            </w:r>
+          </w:p>
+        </w:tc>
+        <w:tc>
+          <w:tcPr>
+            <w:tcW w:type="dxa" w:w="1805"/>
+            <w:shd w:fill="F7F9FB"/>
+            <w:tcMar>
+              <w:top w:w="100" w:type="dxa"/>
+              <w:bottom w:w="100" w:type="dxa"/>
+              <w:left w:w="150" w:type="dxa"/>
+              <w:right w:w="150" w:type="dxa"/>
+            </w:tcMar>
+          </w:tcPr>
+          <w:p>
+            <w:pPr>
+              <w:jc w:val="left"/>
+            </w:pPr>
+            <w:r>
+              <w:rPr>
+                <w:rFonts w:ascii="Arial" w:hAnsi="Arial"/>
+                <w:b w:val="0"/>
+                <w:i w:val="0"/>
+                <w:color w:val="000000"/>
+                <w:sz w:val="16"/>
+              </w:rPr>
+              <w:t>Sector Sur (Deportivo)</w:t>
+            </w:r>
+          </w:p>
+        </w:tc>
+        <w:tc>
+          <w:tcPr>
+            <w:tcW w:type="dxa" w:w="1805"/>
+            <w:shd w:fill="F7F9FB"/>
+            <w:tcMar>
+              <w:top w:w="100" w:type="dxa"/>
+              <w:bottom w:w="100" w:type="dxa"/>
+              <w:left w:w="150" w:type="dxa"/>
+              <w:right w:w="150" w:type="dxa"/>
+            </w:tcMar>
+          </w:tcPr>
+          <w:p>
+            <w:pPr>
+              <w:jc w:val="right"/>
+            </w:pPr>
+            <w:r>
+              <w:rPr>
+                <w:rFonts w:ascii="Arial" w:hAnsi="Arial"/>
+                <w:b/>
+                <w:i w:val="0"/>
+                <w:color w:val="000000"/>
+                <w:sz w:val="16"/>
+              </w:rPr>
+              <w:t>60 m</w:t>
+            </w:r>
+          </w:p>
+        </w:tc>
+        <w:tc>
+          <w:tcPr>
+            <w:tcW w:type="dxa" w:w="1805"/>
+            <w:shd w:fill="F7F9FB"/>
+            <w:tcMar>
+              <w:top w:w="100" w:type="dxa"/>
+              <w:bottom w:w="100" w:type="dxa"/>
+              <w:left w:w="150" w:type="dxa"/>
+              <w:right w:w="150" w:type="dxa"/>
+            </w:tcMar>
+          </w:tcPr>
+          <w:p>
+            <w:pPr>
+              <w:jc w:val="left"/>
+            </w:pPr>
+            <w:r>
+              <w:rPr>
+                <w:rFonts w:ascii="Arial" w:hAnsi="Arial"/>
+                <w:b w:val="0"/>
+                <w:i w:val="0"/>
+                <w:color w:val="000000"/>
+                <w:sz w:val="16"/>
+              </w:rPr>
+              <w:t>Molle + Arrayán + Hierba Luisa</w:t>
+            </w:r>
+          </w:p>
+        </w:tc>
+      </w:tr>
+      <w:tr>
+        <w:tc>
+          <w:tcPr>
+            <w:tcW w:type="dxa" w:w="1805"/>
+            <w:shd w:fill="FFFFFF"/>
+            <w:tcMar>
+              <w:top w:w="100" w:type="dxa"/>
+              <w:bottom w:w="100" w:type="dxa"/>
+              <w:left w:w="150" w:type="dxa"/>
+              <w:right w:w="150" w:type="dxa"/>
+            </w:tcMar>
+          </w:tcPr>
+          <w:p>
+            <w:pPr>
+              <w:jc w:val="center"/>
+            </w:pPr>
+            <w:r>
+              <w:rPr>
+                <w:rFonts w:ascii="Arial" w:hAnsi="Arial"/>
+                <w:b/>
+                <w:i w:val="0"/>
+                <w:color w:val="000000"/>
+                <w:sz w:val="16"/>
+              </w:rPr>
+              <w:t>CV-12</w:t>
+            </w:r>
+          </w:p>
+        </w:tc>
+        <w:tc>
+          <w:tcPr>
+            <w:tcW w:type="dxa" w:w="1805"/>
+            <w:shd w:fill="FFFFFF"/>
+            <w:tcMar>
+              <w:top w:w="100" w:type="dxa"/>
+              <w:bottom w:w="100" w:type="dxa"/>
+              <w:left w:w="150" w:type="dxa"/>
+              <w:right w:w="150" w:type="dxa"/>
+            </w:tcMar>
+          </w:tcPr>
+          <w:p>
+            <w:pPr>
+              <w:jc w:val="left"/>
+            </w:pPr>
+            <w:r>
+              <w:rPr>
+                <w:rFonts w:ascii="Arial" w:hAnsi="Arial"/>
+                <w:b w:val="0"/>
+                <w:i w:val="0"/>
+                <w:color w:val="000000"/>
+                <w:sz w:val="16"/>
+              </w:rPr>
+              <w:t>Cerca Villas Docentes - Borde Acequia</w:t>
+            </w:r>
+          </w:p>
+        </w:tc>
+        <w:tc>
+          <w:tcPr>
+            <w:tcW w:type="dxa" w:w="1805"/>
+            <w:shd w:fill="FFFFFF"/>
+            <w:tcMar>
+              <w:top w:w="100" w:type="dxa"/>
+              <w:bottom w:w="100" w:type="dxa"/>
+              <w:left w:w="150" w:type="dxa"/>
+              <w:right w:w="150" w:type="dxa"/>
+            </w:tcMar>
+          </w:tcPr>
+          <w:p>
+            <w:pPr>
+              <w:jc w:val="left"/>
+            </w:pPr>
+            <w:r>
+              <w:rPr>
+                <w:rFonts w:ascii="Arial" w:hAnsi="Arial"/>
+                <w:b w:val="0"/>
+                <w:i w:val="0"/>
+                <w:color w:val="000000"/>
+                <w:sz w:val="16"/>
+              </w:rPr>
+              <w:t>Sector Sur (Docentes)</w:t>
+            </w:r>
+          </w:p>
+        </w:tc>
+        <w:tc>
+          <w:tcPr>
+            <w:tcW w:type="dxa" w:w="1805"/>
+            <w:shd w:fill="FFFFFF"/>
+            <w:tcMar>
+              <w:top w:w="100" w:type="dxa"/>
+              <w:bottom w:w="100" w:type="dxa"/>
+              <w:left w:w="150" w:type="dxa"/>
+              <w:right w:w="150" w:type="dxa"/>
+            </w:tcMar>
+          </w:tcPr>
+          <w:p>
+            <w:pPr>
+              <w:jc w:val="right"/>
+            </w:pPr>
+            <w:r>
+              <w:rPr>
+                <w:rFonts w:ascii="Arial" w:hAnsi="Arial"/>
+                <w:b/>
+                <w:i w:val="0"/>
+                <w:color w:val="000000"/>
+                <w:sz w:val="16"/>
+              </w:rPr>
+              <w:t>60 m</w:t>
+            </w:r>
+          </w:p>
+        </w:tc>
+        <w:tc>
+          <w:tcPr>
+            <w:tcW w:type="dxa" w:w="1805"/>
+            <w:shd w:fill="FFFFFF"/>
+            <w:tcMar>
+              <w:top w:w="100" w:type="dxa"/>
+              <w:bottom w:w="100" w:type="dxa"/>
+              <w:left w:w="150" w:type="dxa"/>
+              <w:right w:w="150" w:type="dxa"/>
+            </w:tcMar>
+          </w:tcPr>
+          <w:p>
+            <w:pPr>
+              <w:jc w:val="left"/>
+            </w:pPr>
+            <w:r>
+              <w:rPr>
+                <w:rFonts w:ascii="Arial" w:hAnsi="Arial"/>
+                <w:b w:val="0"/>
+                <w:i w:val="0"/>
+                <w:color w:val="000000"/>
+                <w:sz w:val="16"/>
+              </w:rPr>
+              <w:t>Molle + Arrayán/Cedrón + Hierba Luisa</w:t>
+            </w:r>
+          </w:p>
+        </w:tc>
+      </w:tr>
+    </w:tbl>
     <w:p>
       <w:pPr>
         <w:pStyle w:val="Heading1"/>
@@ -5746,28 +7541,983 @@
         </w:rPr>
         <w:t>7.1. Presupuesto Detallado y Benchmarking de Viabilidad:</w:t>
         <w:br/>
-        <w:t>El presupuesto total de inversión inicial asciende exactamente a $1,470.00 USD, lo que representa un costo sumamente bajo de $1.50 USD por metro lineal:</w:t>
+        <w:t>El presupuesto total de inversión inicial asciende exactamente a $1,470.00 USD, lo que representa un costo sumamente bajo de $1.50 USD por metro lineal desplegado (980 m lineales totales):</w:t>
         <w:br/>
-        <w:t>• Plántulas y Material Vegetal (1,960 unidades): $680.00 USD (Schinus molle a $0.50 c/u; Myrcianthes hallii a $0.45 c/u; Cymbopogon citratus y Aloysia citrodora a $0.25 c/u mediante convenio con viveros forestales locales).</w:t>
-        <w:br/>
-        <w:t>• Sistema de Riego por Goteo por Gravedad (980 m manguera PE 16mm + goteros autocompensantes + válvulas manuales): $420.00 USD.</w:t>
-        <w:br/>
-        <w:t>• Enmiendas Orgánicas y Compost: $0.00 USD (suministrado íntegramente por la planta de compostaje institucional de Yachay Tech).</w:t>
-        <w:br/>
-        <w:t>• Postes tutores de bambú andino y señalética QR informativa: $170.00 USD.</w:t>
-        <w:br/>
-        <w:t>• Herramientas menores y logística comunitaria de siembra: $200.00 USD.</w:t>
-        <w:br/>
-        <w:t>Total Inversión Inicial: $1,470.00 USD.</w:t>
-        <w:br/>
-        <w:br/>
-        <w:t>7.2. Comparación Costo-Beneficio frente a Químicos Sintéticos:</w:t>
-        <w:br/>
-        <w:t>Fumigación química tradicional: Costo recurrente de $400 USD/mes ($4,800 USD/año), con pérdida de eficacia por resistencia biológica y grave riesgo ambiental.</w:t>
-        <w:br/>
-        <w:t>Algoritmo Verde: Inversión única de $1,470 USD, autosostenible y con costo operativo anual menor a $120 USD (mantenimiento preventivo).</w:t>
       </w:r>
     </w:p>
+    <w:tbl>
+      <w:tblPr>
+        <w:tblW w:type="auto" w:w="0"/>
+        <w:jc w:val="center"/>
+        <w:tblLook w:firstColumn="1" w:firstRow="1" w:lastColumn="0" w:lastRow="0" w:noHBand="0" w:noVBand="1" w:val="04A0"/>
+      </w:tblPr>
+      <w:tblGrid>
+        <w:gridCol w:w="1805"/>
+        <w:gridCol w:w="1805"/>
+        <w:gridCol w:w="1805"/>
+        <w:gridCol w:w="1805"/>
+        <w:gridCol w:w="1805"/>
+      </w:tblGrid>
+      <w:tr>
+        <w:tc>
+          <w:tcPr>
+            <w:tcW w:type="dxa" w:w="1805"/>
+            <w:shd w:fill="103662"/>
+            <w:tcMar>
+              <w:top w:w="100" w:type="dxa"/>
+              <w:bottom w:w="100" w:type="dxa"/>
+              <w:left w:w="150" w:type="dxa"/>
+              <w:right w:w="150" w:type="dxa"/>
+            </w:tcMar>
+          </w:tcPr>
+          <w:p>
+            <w:pPr>
+              <w:jc w:val="center"/>
+            </w:pPr>
+            <w:r>
+              <w:rPr>
+                <w:rFonts w:ascii="Arial" w:hAnsi="Arial"/>
+                <w:b/>
+                <w:i w:val="0"/>
+                <w:color w:val="FFFFFF"/>
+                <w:sz w:val="17"/>
+              </w:rPr>
+              <w:t>Partida / Rubro</w:t>
+            </w:r>
+          </w:p>
+        </w:tc>
+        <w:tc>
+          <w:tcPr>
+            <w:tcW w:type="dxa" w:w="1805"/>
+            <w:shd w:fill="103662"/>
+            <w:tcMar>
+              <w:top w:w="100" w:type="dxa"/>
+              <w:bottom w:w="100" w:type="dxa"/>
+              <w:left w:w="150" w:type="dxa"/>
+              <w:right w:w="150" w:type="dxa"/>
+            </w:tcMar>
+          </w:tcPr>
+          <w:p>
+            <w:pPr>
+              <w:jc w:val="center"/>
+            </w:pPr>
+            <w:r>
+              <w:rPr>
+                <w:rFonts w:ascii="Arial" w:hAnsi="Arial"/>
+                <w:b/>
+                <w:i w:val="0"/>
+                <w:color w:val="FFFFFF"/>
+                <w:sz w:val="17"/>
+              </w:rPr>
+              <w:t>Descripción Técnica de Insumos</w:t>
+            </w:r>
+          </w:p>
+        </w:tc>
+        <w:tc>
+          <w:tcPr>
+            <w:tcW w:type="dxa" w:w="1805"/>
+            <w:shd w:fill="103662"/>
+            <w:tcMar>
+              <w:top w:w="100" w:type="dxa"/>
+              <w:bottom w:w="100" w:type="dxa"/>
+              <w:left w:w="150" w:type="dxa"/>
+              <w:right w:w="150" w:type="dxa"/>
+            </w:tcMar>
+          </w:tcPr>
+          <w:p>
+            <w:pPr>
+              <w:jc w:val="center"/>
+            </w:pPr>
+            <w:r>
+              <w:rPr>
+                <w:rFonts w:ascii="Arial" w:hAnsi="Arial"/>
+                <w:b/>
+                <w:i w:val="0"/>
+                <w:color w:val="FFFFFF"/>
+                <w:sz w:val="17"/>
+              </w:rPr>
+              <w:t>Cantidad</w:t>
+            </w:r>
+          </w:p>
+        </w:tc>
+        <w:tc>
+          <w:tcPr>
+            <w:tcW w:type="dxa" w:w="1805"/>
+            <w:shd w:fill="103662"/>
+            <w:tcMar>
+              <w:top w:w="100" w:type="dxa"/>
+              <w:bottom w:w="100" w:type="dxa"/>
+              <w:left w:w="150" w:type="dxa"/>
+              <w:right w:w="150" w:type="dxa"/>
+            </w:tcMar>
+          </w:tcPr>
+          <w:p>
+            <w:pPr>
+              <w:jc w:val="center"/>
+            </w:pPr>
+            <w:r>
+              <w:rPr>
+                <w:rFonts w:ascii="Arial" w:hAnsi="Arial"/>
+                <w:b/>
+                <w:i w:val="0"/>
+                <w:color w:val="FFFFFF"/>
+                <w:sz w:val="17"/>
+              </w:rPr>
+              <w:t>Costo Unit.</w:t>
+            </w:r>
+          </w:p>
+        </w:tc>
+        <w:tc>
+          <w:tcPr>
+            <w:tcW w:type="dxa" w:w="1805"/>
+            <w:shd w:fill="103662"/>
+            <w:tcMar>
+              <w:top w:w="100" w:type="dxa"/>
+              <w:bottom w:w="100" w:type="dxa"/>
+              <w:left w:w="150" w:type="dxa"/>
+              <w:right w:w="150" w:type="dxa"/>
+            </w:tcMar>
+          </w:tcPr>
+          <w:p>
+            <w:pPr>
+              <w:jc w:val="center"/>
+            </w:pPr>
+            <w:r>
+              <w:rPr>
+                <w:rFonts w:ascii="Arial" w:hAnsi="Arial"/>
+                <w:b/>
+                <w:i w:val="0"/>
+                <w:color w:val="FFFFFF"/>
+                <w:sz w:val="17"/>
+              </w:rPr>
+              <w:t>Total USD</w:t>
+            </w:r>
+          </w:p>
+        </w:tc>
+      </w:tr>
+      <w:tr>
+        <w:tc>
+          <w:tcPr>
+            <w:tcW w:type="dxa" w:w="1805"/>
+            <w:shd w:fill="F7F9FB"/>
+            <w:tcMar>
+              <w:top w:w="100" w:type="dxa"/>
+              <w:bottom w:w="100" w:type="dxa"/>
+              <w:left w:w="150" w:type="dxa"/>
+              <w:right w:w="150" w:type="dxa"/>
+            </w:tcMar>
+          </w:tcPr>
+          <w:p>
+            <w:pPr>
+              <w:jc w:val="left"/>
+            </w:pPr>
+            <w:r>
+              <w:rPr>
+                <w:rFonts w:ascii="Arial" w:hAnsi="Arial"/>
+                <w:b w:val="0"/>
+                <w:i w:val="0"/>
+                <w:color w:val="000000"/>
+                <w:sz w:val="16"/>
+              </w:rPr>
+              <w:t>Material Vegetal</w:t>
+            </w:r>
+          </w:p>
+        </w:tc>
+        <w:tc>
+          <w:tcPr>
+            <w:tcW w:type="dxa" w:w="1805"/>
+            <w:shd w:fill="F7F9FB"/>
+            <w:tcMar>
+              <w:top w:w="100" w:type="dxa"/>
+              <w:bottom w:w="100" w:type="dxa"/>
+              <w:left w:w="150" w:type="dxa"/>
+              <w:right w:w="150" w:type="dxa"/>
+            </w:tcMar>
+          </w:tcPr>
+          <w:p>
+            <w:pPr>
+              <w:jc w:val="left"/>
+            </w:pPr>
+            <w:r>
+              <w:rPr>
+                <w:rFonts w:ascii="Arial" w:hAnsi="Arial"/>
+                <w:b w:val="0"/>
+                <w:i w:val="0"/>
+                <w:color w:val="000000"/>
+                <w:sz w:val="16"/>
+              </w:rPr>
+              <w:t>Plántulas de Molle (S. molle), Arrayán (M. hallii), Cedrón (A. citrodora) y esquejes de C. citratus</w:t>
+            </w:r>
+          </w:p>
+        </w:tc>
+        <w:tc>
+          <w:tcPr>
+            <w:tcW w:type="dxa" w:w="1805"/>
+            <w:shd w:fill="F7F9FB"/>
+            <w:tcMar>
+              <w:top w:w="100" w:type="dxa"/>
+              <w:bottom w:w="100" w:type="dxa"/>
+              <w:left w:w="150" w:type="dxa"/>
+              <w:right w:w="150" w:type="dxa"/>
+            </w:tcMar>
+          </w:tcPr>
+          <w:p>
+            <w:pPr>
+              <w:jc w:val="center"/>
+            </w:pPr>
+            <w:r>
+              <w:rPr>
+                <w:rFonts w:ascii="Arial" w:hAnsi="Arial"/>
+                <w:b w:val="0"/>
+                <w:i w:val="0"/>
+                <w:color w:val="000000"/>
+                <w:sz w:val="16"/>
+              </w:rPr>
+              <w:t>1,960 plántulas</w:t>
+            </w:r>
+          </w:p>
+        </w:tc>
+        <w:tc>
+          <w:tcPr>
+            <w:tcW w:type="dxa" w:w="1805"/>
+            <w:shd w:fill="F7F9FB"/>
+            <w:tcMar>
+              <w:top w:w="100" w:type="dxa"/>
+              <w:bottom w:w="100" w:type="dxa"/>
+              <w:left w:w="150" w:type="dxa"/>
+              <w:right w:w="150" w:type="dxa"/>
+            </w:tcMar>
+          </w:tcPr>
+          <w:p>
+            <w:pPr>
+              <w:jc w:val="right"/>
+            </w:pPr>
+            <w:r>
+              <w:rPr>
+                <w:rFonts w:ascii="Arial" w:hAnsi="Arial"/>
+                <w:b w:val="0"/>
+                <w:i w:val="0"/>
+                <w:color w:val="000000"/>
+                <w:sz w:val="16"/>
+              </w:rPr>
+              <w:t>Prom. $0.35</w:t>
+            </w:r>
+          </w:p>
+        </w:tc>
+        <w:tc>
+          <w:tcPr>
+            <w:tcW w:type="dxa" w:w="1805"/>
+            <w:shd w:fill="F7F9FB"/>
+            <w:tcMar>
+              <w:top w:w="100" w:type="dxa"/>
+              <w:bottom w:w="100" w:type="dxa"/>
+              <w:left w:w="150" w:type="dxa"/>
+              <w:right w:w="150" w:type="dxa"/>
+            </w:tcMar>
+          </w:tcPr>
+          <w:p>
+            <w:pPr>
+              <w:jc w:val="right"/>
+            </w:pPr>
+            <w:r>
+              <w:rPr>
+                <w:rFonts w:ascii="Arial" w:hAnsi="Arial"/>
+                <w:b/>
+                <w:i w:val="0"/>
+                <w:color w:val="000000"/>
+                <w:sz w:val="16"/>
+              </w:rPr>
+              <w:t>$680.00</w:t>
+            </w:r>
+          </w:p>
+        </w:tc>
+      </w:tr>
+      <w:tr>
+        <w:tc>
+          <w:tcPr>
+            <w:tcW w:type="dxa" w:w="1805"/>
+            <w:shd w:fill="FFFFFF"/>
+            <w:tcMar>
+              <w:top w:w="100" w:type="dxa"/>
+              <w:bottom w:w="100" w:type="dxa"/>
+              <w:left w:w="150" w:type="dxa"/>
+              <w:right w:w="150" w:type="dxa"/>
+            </w:tcMar>
+          </w:tcPr>
+          <w:p>
+            <w:pPr>
+              <w:jc w:val="left"/>
+            </w:pPr>
+            <w:r>
+              <w:rPr>
+                <w:rFonts w:ascii="Arial" w:hAnsi="Arial"/>
+                <w:b w:val="0"/>
+                <w:i w:val="0"/>
+                <w:color w:val="000000"/>
+                <w:sz w:val="16"/>
+              </w:rPr>
+              <w:t>Sistema de Riego</w:t>
+            </w:r>
+          </w:p>
+        </w:tc>
+        <w:tc>
+          <w:tcPr>
+            <w:tcW w:type="dxa" w:w="1805"/>
+            <w:shd w:fill="FFFFFF"/>
+            <w:tcMar>
+              <w:top w:w="100" w:type="dxa"/>
+              <w:bottom w:w="100" w:type="dxa"/>
+              <w:left w:w="150" w:type="dxa"/>
+              <w:right w:w="150" w:type="dxa"/>
+            </w:tcMar>
+          </w:tcPr>
+          <w:p>
+            <w:pPr>
+              <w:jc w:val="left"/>
+            </w:pPr>
+            <w:r>
+              <w:rPr>
+                <w:rFonts w:ascii="Arial" w:hAnsi="Arial"/>
+                <w:b w:val="0"/>
+                <w:i w:val="0"/>
+                <w:color w:val="000000"/>
+                <w:sz w:val="16"/>
+              </w:rPr>
+              <w:t>Manguera PE 16mm, microgoteros autocompensantes 2 L/h, llaves de paso y conectores a gravedad</w:t>
+            </w:r>
+          </w:p>
+        </w:tc>
+        <w:tc>
+          <w:tcPr>
+            <w:tcW w:type="dxa" w:w="1805"/>
+            <w:shd w:fill="FFFFFF"/>
+            <w:tcMar>
+              <w:top w:w="100" w:type="dxa"/>
+              <w:bottom w:w="100" w:type="dxa"/>
+              <w:left w:w="150" w:type="dxa"/>
+              <w:right w:w="150" w:type="dxa"/>
+            </w:tcMar>
+          </w:tcPr>
+          <w:p>
+            <w:pPr>
+              <w:jc w:val="center"/>
+            </w:pPr>
+            <w:r>
+              <w:rPr>
+                <w:rFonts w:ascii="Arial" w:hAnsi="Arial"/>
+                <w:b w:val="0"/>
+                <w:i w:val="0"/>
+                <w:color w:val="000000"/>
+                <w:sz w:val="16"/>
+              </w:rPr>
+              <w:t>980 m lineales</w:t>
+            </w:r>
+          </w:p>
+        </w:tc>
+        <w:tc>
+          <w:tcPr>
+            <w:tcW w:type="dxa" w:w="1805"/>
+            <w:shd w:fill="FFFFFF"/>
+            <w:tcMar>
+              <w:top w:w="100" w:type="dxa"/>
+              <w:bottom w:w="100" w:type="dxa"/>
+              <w:left w:w="150" w:type="dxa"/>
+              <w:right w:w="150" w:type="dxa"/>
+            </w:tcMar>
+          </w:tcPr>
+          <w:p>
+            <w:pPr>
+              <w:jc w:val="right"/>
+            </w:pPr>
+            <w:r>
+              <w:rPr>
+                <w:rFonts w:ascii="Arial" w:hAnsi="Arial"/>
+                <w:b w:val="0"/>
+                <w:i w:val="0"/>
+                <w:color w:val="000000"/>
+                <w:sz w:val="16"/>
+              </w:rPr>
+              <w:t>$0.43 / m</w:t>
+            </w:r>
+          </w:p>
+        </w:tc>
+        <w:tc>
+          <w:tcPr>
+            <w:tcW w:type="dxa" w:w="1805"/>
+            <w:shd w:fill="FFFFFF"/>
+            <w:tcMar>
+              <w:top w:w="100" w:type="dxa"/>
+              <w:bottom w:w="100" w:type="dxa"/>
+              <w:left w:w="150" w:type="dxa"/>
+              <w:right w:w="150" w:type="dxa"/>
+            </w:tcMar>
+          </w:tcPr>
+          <w:p>
+            <w:pPr>
+              <w:jc w:val="right"/>
+            </w:pPr>
+            <w:r>
+              <w:rPr>
+                <w:rFonts w:ascii="Arial" w:hAnsi="Arial"/>
+                <w:b/>
+                <w:i w:val="0"/>
+                <w:color w:val="000000"/>
+                <w:sz w:val="16"/>
+              </w:rPr>
+              <w:t>$420.00</w:t>
+            </w:r>
+          </w:p>
+        </w:tc>
+      </w:tr>
+      <w:tr>
+        <w:tc>
+          <w:tcPr>
+            <w:tcW w:type="dxa" w:w="1805"/>
+            <w:shd w:fill="F7F9FB"/>
+            <w:tcMar>
+              <w:top w:w="100" w:type="dxa"/>
+              <w:bottom w:w="100" w:type="dxa"/>
+              <w:left w:w="150" w:type="dxa"/>
+              <w:right w:w="150" w:type="dxa"/>
+            </w:tcMar>
+          </w:tcPr>
+          <w:p>
+            <w:pPr>
+              <w:jc w:val="left"/>
+            </w:pPr>
+            <w:r>
+              <w:rPr>
+                <w:rFonts w:ascii="Arial" w:hAnsi="Arial"/>
+                <w:b w:val="0"/>
+                <w:i w:val="0"/>
+                <w:color w:val="000000"/>
+                <w:sz w:val="16"/>
+              </w:rPr>
+              <w:t>Enmiendas Orgánicas</w:t>
+            </w:r>
+          </w:p>
+        </w:tc>
+        <w:tc>
+          <w:tcPr>
+            <w:tcW w:type="dxa" w:w="1805"/>
+            <w:shd w:fill="F7F9FB"/>
+            <w:tcMar>
+              <w:top w:w="100" w:type="dxa"/>
+              <w:bottom w:w="100" w:type="dxa"/>
+              <w:left w:w="150" w:type="dxa"/>
+              <w:right w:w="150" w:type="dxa"/>
+            </w:tcMar>
+          </w:tcPr>
+          <w:p>
+            <w:pPr>
+              <w:jc w:val="left"/>
+            </w:pPr>
+            <w:r>
+              <w:rPr>
+                <w:rFonts w:ascii="Arial" w:hAnsi="Arial"/>
+                <w:b w:val="0"/>
+                <w:i w:val="0"/>
+                <w:color w:val="000000"/>
+                <w:sz w:val="16"/>
+              </w:rPr>
+              <w:t>Compost maduro institucional producido en la planta de tratamiento de Yachay Tech</w:t>
+            </w:r>
+          </w:p>
+        </w:tc>
+        <w:tc>
+          <w:tcPr>
+            <w:tcW w:type="dxa" w:w="1805"/>
+            <w:shd w:fill="F7F9FB"/>
+            <w:tcMar>
+              <w:top w:w="100" w:type="dxa"/>
+              <w:bottom w:w="100" w:type="dxa"/>
+              <w:left w:w="150" w:type="dxa"/>
+              <w:right w:w="150" w:type="dxa"/>
+            </w:tcMar>
+          </w:tcPr>
+          <w:p>
+            <w:pPr>
+              <w:jc w:val="center"/>
+            </w:pPr>
+            <w:r>
+              <w:rPr>
+                <w:rFonts w:ascii="Arial" w:hAnsi="Arial"/>
+                <w:b w:val="0"/>
+                <w:i w:val="0"/>
+                <w:color w:val="000000"/>
+                <w:sz w:val="16"/>
+              </w:rPr>
+              <w:t>1.5 toneladas</w:t>
+            </w:r>
+          </w:p>
+        </w:tc>
+        <w:tc>
+          <w:tcPr>
+            <w:tcW w:type="dxa" w:w="1805"/>
+            <w:shd w:fill="F7F9FB"/>
+            <w:tcMar>
+              <w:top w:w="100" w:type="dxa"/>
+              <w:bottom w:w="100" w:type="dxa"/>
+              <w:left w:w="150" w:type="dxa"/>
+              <w:right w:w="150" w:type="dxa"/>
+            </w:tcMar>
+          </w:tcPr>
+          <w:p>
+            <w:pPr>
+              <w:jc w:val="right"/>
+            </w:pPr>
+            <w:r>
+              <w:rPr>
+                <w:rFonts w:ascii="Arial" w:hAnsi="Arial"/>
+                <w:b w:val="0"/>
+                <w:i w:val="0"/>
+                <w:color w:val="000000"/>
+                <w:sz w:val="16"/>
+              </w:rPr>
+              <w:t>$0.00 (Interno)</w:t>
+            </w:r>
+          </w:p>
+        </w:tc>
+        <w:tc>
+          <w:tcPr>
+            <w:tcW w:type="dxa" w:w="1805"/>
+            <w:shd w:fill="F7F9FB"/>
+            <w:tcMar>
+              <w:top w:w="100" w:type="dxa"/>
+              <w:bottom w:w="100" w:type="dxa"/>
+              <w:left w:w="150" w:type="dxa"/>
+              <w:right w:w="150" w:type="dxa"/>
+            </w:tcMar>
+          </w:tcPr>
+          <w:p>
+            <w:pPr>
+              <w:jc w:val="right"/>
+            </w:pPr>
+            <w:r>
+              <w:rPr>
+                <w:rFonts w:ascii="Arial" w:hAnsi="Arial"/>
+                <w:b/>
+                <w:i w:val="0"/>
+                <w:color w:val="000000"/>
+                <w:sz w:val="16"/>
+              </w:rPr>
+              <w:t>$0.00</w:t>
+            </w:r>
+          </w:p>
+        </w:tc>
+      </w:tr>
+      <w:tr>
+        <w:tc>
+          <w:tcPr>
+            <w:tcW w:type="dxa" w:w="1805"/>
+            <w:shd w:fill="FFFFFF"/>
+            <w:tcMar>
+              <w:top w:w="100" w:type="dxa"/>
+              <w:bottom w:w="100" w:type="dxa"/>
+              <w:left w:w="150" w:type="dxa"/>
+              <w:right w:w="150" w:type="dxa"/>
+            </w:tcMar>
+          </w:tcPr>
+          <w:p>
+            <w:pPr>
+              <w:jc w:val="left"/>
+            </w:pPr>
+            <w:r>
+              <w:rPr>
+                <w:rFonts w:ascii="Arial" w:hAnsi="Arial"/>
+                <w:b w:val="0"/>
+                <w:i w:val="0"/>
+                <w:color w:val="000000"/>
+                <w:sz w:val="16"/>
+              </w:rPr>
+              <w:t>Infraestructura Apoyo</w:t>
+            </w:r>
+          </w:p>
+        </w:tc>
+        <w:tc>
+          <w:tcPr>
+            <w:tcW w:type="dxa" w:w="1805"/>
+            <w:shd w:fill="FFFFFF"/>
+            <w:tcMar>
+              <w:top w:w="100" w:type="dxa"/>
+              <w:bottom w:w="100" w:type="dxa"/>
+              <w:left w:w="150" w:type="dxa"/>
+              <w:right w:w="150" w:type="dxa"/>
+            </w:tcMar>
+          </w:tcPr>
+          <w:p>
+            <w:pPr>
+              <w:jc w:val="left"/>
+            </w:pPr>
+            <w:r>
+              <w:rPr>
+                <w:rFonts w:ascii="Arial" w:hAnsi="Arial"/>
+                <w:b w:val="0"/>
+                <w:i w:val="0"/>
+                <w:color w:val="000000"/>
+                <w:sz w:val="16"/>
+              </w:rPr>
+              <w:t>Postes tutores de caña guadua / bambú andino y placas QR informativas en acrílico</w:t>
+            </w:r>
+          </w:p>
+        </w:tc>
+        <w:tc>
+          <w:tcPr>
+            <w:tcW w:type="dxa" w:w="1805"/>
+            <w:shd w:fill="FFFFFF"/>
+            <w:tcMar>
+              <w:top w:w="100" w:type="dxa"/>
+              <w:bottom w:w="100" w:type="dxa"/>
+              <w:left w:w="150" w:type="dxa"/>
+              <w:right w:w="150" w:type="dxa"/>
+            </w:tcMar>
+          </w:tcPr>
+          <w:p>
+            <w:pPr>
+              <w:jc w:val="center"/>
+            </w:pPr>
+            <w:r>
+              <w:rPr>
+                <w:rFonts w:ascii="Arial" w:hAnsi="Arial"/>
+                <w:b w:val="0"/>
+                <w:i w:val="0"/>
+                <w:color w:val="000000"/>
+                <w:sz w:val="16"/>
+              </w:rPr>
+              <w:t>120 unidades</w:t>
+            </w:r>
+          </w:p>
+        </w:tc>
+        <w:tc>
+          <w:tcPr>
+            <w:tcW w:type="dxa" w:w="1805"/>
+            <w:shd w:fill="FFFFFF"/>
+            <w:tcMar>
+              <w:top w:w="100" w:type="dxa"/>
+              <w:bottom w:w="100" w:type="dxa"/>
+              <w:left w:w="150" w:type="dxa"/>
+              <w:right w:w="150" w:type="dxa"/>
+            </w:tcMar>
+          </w:tcPr>
+          <w:p>
+            <w:pPr>
+              <w:jc w:val="right"/>
+            </w:pPr>
+            <w:r>
+              <w:rPr>
+                <w:rFonts w:ascii="Arial" w:hAnsi="Arial"/>
+                <w:b w:val="0"/>
+                <w:i w:val="0"/>
+                <w:color w:val="000000"/>
+                <w:sz w:val="16"/>
+              </w:rPr>
+              <w:t>$1.42 c/u</w:t>
+            </w:r>
+          </w:p>
+        </w:tc>
+        <w:tc>
+          <w:tcPr>
+            <w:tcW w:type="dxa" w:w="1805"/>
+            <w:shd w:fill="FFFFFF"/>
+            <w:tcMar>
+              <w:top w:w="100" w:type="dxa"/>
+              <w:bottom w:w="100" w:type="dxa"/>
+              <w:left w:w="150" w:type="dxa"/>
+              <w:right w:w="150" w:type="dxa"/>
+            </w:tcMar>
+          </w:tcPr>
+          <w:p>
+            <w:pPr>
+              <w:jc w:val="right"/>
+            </w:pPr>
+            <w:r>
+              <w:rPr>
+                <w:rFonts w:ascii="Arial" w:hAnsi="Arial"/>
+                <w:b/>
+                <w:i w:val="0"/>
+                <w:color w:val="000000"/>
+                <w:sz w:val="16"/>
+              </w:rPr>
+              <w:t>$170.00</w:t>
+            </w:r>
+          </w:p>
+        </w:tc>
+      </w:tr>
+      <w:tr>
+        <w:tc>
+          <w:tcPr>
+            <w:tcW w:type="dxa" w:w="1805"/>
+            <w:shd w:fill="F7F9FB"/>
+            <w:tcMar>
+              <w:top w:w="100" w:type="dxa"/>
+              <w:bottom w:w="100" w:type="dxa"/>
+              <w:left w:w="150" w:type="dxa"/>
+              <w:right w:w="150" w:type="dxa"/>
+            </w:tcMar>
+          </w:tcPr>
+          <w:p>
+            <w:pPr>
+              <w:jc w:val="left"/>
+            </w:pPr>
+            <w:r>
+              <w:rPr>
+                <w:rFonts w:ascii="Arial" w:hAnsi="Arial"/>
+                <w:b w:val="0"/>
+                <w:i w:val="0"/>
+                <w:color w:val="000000"/>
+                <w:sz w:val="16"/>
+              </w:rPr>
+              <w:t>Logística de Siembra</w:t>
+            </w:r>
+          </w:p>
+        </w:tc>
+        <w:tc>
+          <w:tcPr>
+            <w:tcW w:type="dxa" w:w="1805"/>
+            <w:shd w:fill="F7F9FB"/>
+            <w:tcMar>
+              <w:top w:w="100" w:type="dxa"/>
+              <w:bottom w:w="100" w:type="dxa"/>
+              <w:left w:w="150" w:type="dxa"/>
+              <w:right w:w="150" w:type="dxa"/>
+            </w:tcMar>
+          </w:tcPr>
+          <w:p>
+            <w:pPr>
+              <w:jc w:val="left"/>
+            </w:pPr>
+            <w:r>
+              <w:rPr>
+                <w:rFonts w:ascii="Arial" w:hAnsi="Arial"/>
+                <w:b w:val="0"/>
+                <w:i w:val="0"/>
+                <w:color w:val="000000"/>
+                <w:sz w:val="16"/>
+              </w:rPr>
+              <w:t>Herramientas menores, guantes, palas y refrigerios de brigadas de voluntariado</w:t>
+            </w:r>
+          </w:p>
+        </w:tc>
+        <w:tc>
+          <w:tcPr>
+            <w:tcW w:type="dxa" w:w="1805"/>
+            <w:shd w:fill="F7F9FB"/>
+            <w:tcMar>
+              <w:top w:w="100" w:type="dxa"/>
+              <w:bottom w:w="100" w:type="dxa"/>
+              <w:left w:w="150" w:type="dxa"/>
+              <w:right w:w="150" w:type="dxa"/>
+            </w:tcMar>
+          </w:tcPr>
+          <w:p>
+            <w:pPr>
+              <w:jc w:val="center"/>
+            </w:pPr>
+            <w:r>
+              <w:rPr>
+                <w:rFonts w:ascii="Arial" w:hAnsi="Arial"/>
+                <w:b w:val="0"/>
+                <w:i w:val="0"/>
+                <w:color w:val="000000"/>
+                <w:sz w:val="16"/>
+              </w:rPr>
+              <w:t>1 evento global</w:t>
+            </w:r>
+          </w:p>
+        </w:tc>
+        <w:tc>
+          <w:tcPr>
+            <w:tcW w:type="dxa" w:w="1805"/>
+            <w:shd w:fill="F7F9FB"/>
+            <w:tcMar>
+              <w:top w:w="100" w:type="dxa"/>
+              <w:bottom w:w="100" w:type="dxa"/>
+              <w:left w:w="150" w:type="dxa"/>
+              <w:right w:w="150" w:type="dxa"/>
+            </w:tcMar>
+          </w:tcPr>
+          <w:p>
+            <w:pPr>
+              <w:jc w:val="right"/>
+            </w:pPr>
+            <w:r>
+              <w:rPr>
+                <w:rFonts w:ascii="Arial" w:hAnsi="Arial"/>
+                <w:b w:val="0"/>
+                <w:i w:val="0"/>
+                <w:color w:val="000000"/>
+                <w:sz w:val="16"/>
+              </w:rPr>
+              <w:t>Global</w:t>
+            </w:r>
+          </w:p>
+        </w:tc>
+        <w:tc>
+          <w:tcPr>
+            <w:tcW w:type="dxa" w:w="1805"/>
+            <w:shd w:fill="F7F9FB"/>
+            <w:tcMar>
+              <w:top w:w="100" w:type="dxa"/>
+              <w:bottom w:w="100" w:type="dxa"/>
+              <w:left w:w="150" w:type="dxa"/>
+              <w:right w:w="150" w:type="dxa"/>
+            </w:tcMar>
+          </w:tcPr>
+          <w:p>
+            <w:pPr>
+              <w:jc w:val="right"/>
+            </w:pPr>
+            <w:r>
+              <w:rPr>
+                <w:rFonts w:ascii="Arial" w:hAnsi="Arial"/>
+                <w:b/>
+                <w:i w:val="0"/>
+                <w:color w:val="000000"/>
+                <w:sz w:val="16"/>
+              </w:rPr>
+              <w:t>$200.00</w:t>
+            </w:r>
+          </w:p>
+        </w:tc>
+      </w:tr>
+      <w:tr>
+        <w:tc>
+          <w:tcPr>
+            <w:tcW w:type="dxa" w:w="1805"/>
+            <w:shd w:fill="EBF3FA"/>
+            <w:tcMar>
+              <w:top w:w="100" w:type="dxa"/>
+              <w:bottom w:w="100" w:type="dxa"/>
+              <w:left w:w="150" w:type="dxa"/>
+              <w:right w:w="150" w:type="dxa"/>
+            </w:tcMar>
+          </w:tcPr>
+          <w:p>
+            <w:pPr>
+              <w:jc w:val="left"/>
+            </w:pPr>
+            <w:r>
+              <w:rPr>
+                <w:rFonts w:ascii="Arial" w:hAnsi="Arial"/>
+                <w:b/>
+                <w:i w:val="0"/>
+                <w:color w:val="000000"/>
+                <w:sz w:val="17"/>
+              </w:rPr>
+              <w:t>TOTAL INVERSIÓN</w:t>
+            </w:r>
+          </w:p>
+        </w:tc>
+        <w:tc>
+          <w:tcPr>
+            <w:tcW w:type="dxa" w:w="1805"/>
+            <w:shd w:fill="EBF3FA"/>
+            <w:tcMar>
+              <w:top w:w="100" w:type="dxa"/>
+              <w:bottom w:w="100" w:type="dxa"/>
+              <w:left w:w="150" w:type="dxa"/>
+              <w:right w:w="150" w:type="dxa"/>
+            </w:tcMar>
+          </w:tcPr>
+          <w:p>
+            <w:pPr>
+              <w:jc w:val="left"/>
+            </w:pPr>
+            <w:r>
+              <w:rPr>
+                <w:rFonts w:ascii="Arial" w:hAnsi="Arial"/>
+                <w:b/>
+                <w:i w:val="0"/>
+                <w:color w:val="000000"/>
+                <w:sz w:val="17"/>
+              </w:rPr>
+              <w:t>Costo unitario global optimizado: $1.50 USD / metro lineal</w:t>
+            </w:r>
+          </w:p>
+        </w:tc>
+        <w:tc>
+          <w:tcPr>
+            <w:tcW w:type="dxa" w:w="1805"/>
+            <w:shd w:fill="EBF3FA"/>
+            <w:tcMar>
+              <w:top w:w="100" w:type="dxa"/>
+              <w:bottom w:w="100" w:type="dxa"/>
+              <w:left w:w="150" w:type="dxa"/>
+              <w:right w:w="150" w:type="dxa"/>
+            </w:tcMar>
+          </w:tcPr>
+          <w:p>
+            <w:pPr>
+              <w:jc w:val="center"/>
+            </w:pPr>
+            <w:r>
+              <w:rPr>
+                <w:rFonts w:ascii="Arial" w:hAnsi="Arial"/>
+                <w:b/>
+                <w:i w:val="0"/>
+                <w:color w:val="000000"/>
+                <w:sz w:val="17"/>
+              </w:rPr>
+              <w:t>980 m totales</w:t>
+            </w:r>
+          </w:p>
+        </w:tc>
+        <w:tc>
+          <w:tcPr>
+            <w:tcW w:type="dxa" w:w="1805"/>
+            <w:shd w:fill="EBF3FA"/>
+            <w:tcMar>
+              <w:top w:w="100" w:type="dxa"/>
+              <w:bottom w:w="100" w:type="dxa"/>
+              <w:left w:w="150" w:type="dxa"/>
+              <w:right w:w="150" w:type="dxa"/>
+            </w:tcMar>
+          </w:tcPr>
+          <w:p>
+            <w:pPr>
+              <w:jc w:val="right"/>
+            </w:pPr>
+            <w:r>
+              <w:rPr>
+                <w:rFonts w:ascii="Arial" w:hAnsi="Arial"/>
+                <w:b/>
+                <w:i w:val="0"/>
+                <w:color w:val="000000"/>
+                <w:sz w:val="17"/>
+              </w:rPr>
+              <w:t>-</w:t>
+            </w:r>
+          </w:p>
+        </w:tc>
+        <w:tc>
+          <w:tcPr>
+            <w:tcW w:type="dxa" w:w="1805"/>
+            <w:shd w:fill="EBF3FA"/>
+            <w:tcMar>
+              <w:top w:w="100" w:type="dxa"/>
+              <w:bottom w:w="100" w:type="dxa"/>
+              <w:left w:w="150" w:type="dxa"/>
+              <w:right w:w="150" w:type="dxa"/>
+            </w:tcMar>
+          </w:tcPr>
+          <w:p>
+            <w:pPr>
+              <w:jc w:val="right"/>
+            </w:pPr>
+            <w:r>
+              <w:rPr>
+                <w:rFonts w:ascii="Arial" w:hAnsi="Arial"/>
+                <w:b/>
+                <w:i w:val="0"/>
+                <w:color w:val="000000"/>
+                <w:sz w:val="17"/>
+              </w:rPr>
+              <w:t>$1,470.00</w:t>
+            </w:r>
+          </w:p>
+        </w:tc>
+      </w:tr>
+    </w:tbl>
     <w:p>
       <w:pPr>
         <w:pBdr>

</xml_diff>

<commit_message>
feat(gis): incorporar Pozo en mal estado (I-20) y Tachos San Jose (B-08) elevando catalogo a 238 entidades (50 Points, 122 Polygons, 66 LineStrings)
</commit_message>
<xml_diff>
--- a/WhatsApp Chat with Ideaton/Plantilla Documento Tecnico Reto 3.01_COMPLETO.docx
+++ b/WhatsApp Chat with Ideaton/Plantilla Documento Tecnico Reto 3.01_COMPLETO.docx
@@ -1350,7 +1350,7 @@
           <w:color w:val="333333"/>
           <w:sz w:val="19"/>
         </w:rPr>
-        <w:t>En la Universidad Yachay Tech (valle de Urcuquí), la proliferación diurna del complejo de arenillas hematófagas (Simulium spp., Culicoides spp. y Lutzomyia spp.) genera severas molestias y riesgo sanitario en 121 edificaciones del campus. Para mitigar esta plaga sin recurrir a insecticidas sintéticos que contaminen las acequias de riego del cantón, el equipo Algoritmo Verde formuló una estrategia de Manejo Integrado Ecosistémico estructurada en tres ejes sinérgicos: (1) Barrera viva vegetal tri-estrato de 980 metros lineales (Schinus molle en estrato arbóreo, Myrcianthes hallii en estrato arbustivo, y Cymbopogon citratus junto con Aloysia citrodora en estrato herbáceo hipoalergénico); (2) Manejo biológico de bajo impacto mediante conservación de ninfas autóctonas de odonatos en el reservorio léntico y micro-dosificación selectiva de Bacillus thuringiensis israelensis (Bti); y (3) Optimización matemática espacial (SLSQP) alimentada por un catálogo SIG de 236 entidades georreferenciadas. El modelo alcanza una reducción estimada del 82.8% en la tasa de picaduras con una inversión inicial sumamente eficiente de $1,470.00 USD ($1.50/m lineal), integrando riego por goteo por gravedad, compostaje propio y monitoreo telemétrico accesible vía web.</w:t>
+        <w:t>En la Universidad Yachay Tech (valle de Urcuquí), la proliferación diurna del complejo de arenillas hematófagas (Simulium spp., Culicoides spp. y Lutzomyia spp.) genera severas molestias y riesgo sanitario en 121 edificaciones del campus. Para mitigar esta plaga sin recurrir a insecticidas sintéticos que contaminen las acequias de riego del cantón, el equipo Algoritmo Verde formuló una estrategia de Manejo Integrado Ecosistémico estructurada en tres ejes sinérgicos: (1) Barrera viva vegetal tri-estrato de 980 metros lineales (Schinus molle en estrato arbóreo, Myrcianthes hallii en estrato arbustivo, y Cymbopogon citratus junto con Aloysia citrodora en estrato herbáceo hipoalergénico); (2) Manejo biológico de bajo impacto mediante conservación de ninfas autóctonas de odonatos en el reservorio léntico y micro-dosificación selectiva de Bacillus thuringiensis israelensis (Bti); y (3) Optimización matemática espacial (SLSQP) alimentada por un catálogo SIG de 238 entidades georreferenciadas. El modelo alcanza una reducción estimada del 82.8% en la tasa de picaduras con una inversión inicial sumamente eficiente de $1,470.00 USD ($1.50/m lineal), integrando riego por goteo por gravedad, compostaje propio y monitoreo telemétrico accesible vía web.</w:t>
         <w:br/>
         <w:br/>
         <w:t>Palabras clave: Simuliidae, Culicoides, Manejo Integrado Ecosistémico, Cercas vivas tri-estrato, Optimización SLSQP, Yachay Tech.</w:t>
@@ -1371,7 +1371,7 @@
           <w:color w:val="333333"/>
           <w:sz w:val="19"/>
         </w:rPr>
-        <w:t>At Yachay Tech University (Urcuquí Valley, Ecuador), the proliferation of biting midges and blackflies (Simulium spp., Culicoides spp., and Lutzomyia spp.) severely affects outdoor habitability across 121 campus structures. To resolve this challenge without synthetic chemical pesticides that threaten regional irrigation networks, Algoritmo Verde engineered an Ecosystem-based Integrated Pest Management framework centered on three components: (1) A 980-meter hypoallergenic 3-strata botanical barrier (Schinus molle, Myrcianthes hallii, and Cymbopogon citratus paired with Aloysia citrodora); (2) Biological conservation leveraging native odonate nymphs in the campus reservoir alongside targeted Bacillus thuringiensis israelensis (Bti) micro-applications; and (3) Non-linear mathematical spatial optimization (SLSQP algorithm) informed by a 236-entity GIS database. The system achieves an estimated 82.8% biting reduction at an extraordinarily cost-effective budget of $1,470.00 USD ($1.50 per linear meter). This solution guarantees environmental safety, long-term bioclimatic resilience, and participatory campus stewardship.</w:t>
+        <w:t>At Yachay Tech University (Urcuquí Valley, Ecuador), the proliferation of biting midges and blackflies (Simulium spp., Culicoides spp., and Lutzomyia spp.) severely affects outdoor habitability across 121 campus structures. To resolve this challenge without synthetic chemical pesticides that threaten regional irrigation networks, Algoritmo Verde engineered an Ecosystem-based Integrated Pest Management framework centered on three components: (1) A 980-meter hypoallergenic 3-strata botanical barrier (Schinus molle, Myrcianthes hallii, and Cymbopogon citratus paired with Aloysia citrodora); (2) Biological conservation leveraging native odonate nymphs in the campus reservoir alongside targeted Bacillus thuringiensis israelensis (Bti) micro-applications; and (3) Non-linear mathematical spatial optimization (SLSQP algorithm) informed by a 238-entity GIS database. The system achieves an estimated 82.8% biting reduction at an extraordinarily cost-effective budget of $1,470.00 USD ($1.50 per linear meter). This solution guarantees environmental safety, long-term bioclimatic resilience, and participatory campus stewardship.</w:t>
         <w:br/>
         <w:br/>
         <w:t>Keywords: Simuliidae, Culicoides, Ecosystem Management, 3-Strata Living Fences, SLSQP Optimization, GIS Campus Map.</w:t>
@@ -9662,7 +9662,7 @@
         </w:rPr>
         <w:t>1. Problema Resuelto: Se diseñó una solución biológica, no invasiva y de alta ingeniería para mitigar el ataque del complejo vectorial de arenillas (Simulium spp., Culicoides spp., Lutzomyia spp.) en el campus de Yachay Tech, protegiendo 121 edificaciones sin verter agroquímicos a los canales de riego.</w:t>
         <w:br/>
-        <w:t>2. Rigor Científico y Tecnológico: La integración del catálogo SIG de 236 entidades georreferenciadas con la optimización espacial SLSQP permitió dimensionar una barrera viva tri-estrato de 980 metros lineales que maximiza la protección humana (82.8% de mitigación estimada) por un presupuesto realista de $1,470.00 USD.</w:t>
+        <w:t>2. Rigor Científico y Tecnológico: La integración del catálogo SIG de 238 entidades georreferenciadas con la optimización espacial SLSQP permitió dimensionar una barrera viva tri-estrato de 980 metros lineales que maximiza la protección humana (82.8% de mitigación estimada) por un presupuesto realista de $1,470.00 USD.</w:t>
         <w:br/>
         <w:t>3. Limitaciones Reconocidas: La barrera arbórea y arbustiva requiere de 6 a 12 meses para su consolidación estructural completa; sin embargo, el estrato basal herbáceo de Hierba Luisa y Cedrón provee repelencia fitoquímica funcional a partir de la tercera semana de siembra.</w:t>
         <w:br/>
@@ -10477,7 +10477,7 @@
                 <w:color w:val="000000"/>
                 <w:sz w:val="17"/>
               </w:rPr>
-              <w:t>Optimización matemática multiobjetivo de trayectorias (algoritmo SLSQP) y renderizado del mapa geoespacial interactivo de 236 entidades.</w:t>
+              <w:t>Optimización matemática multiobjetivo de trayectorias (algoritmo SLSQP) y renderizado del mapa geoespacial interactivo de 238 entidades.</w:t>
             </w:r>
           </w:p>
         </w:tc>
@@ -10815,7 +10815,7 @@
         <w:br/>
         <w:t>1. Visor Geoespacial Interactivo Web (Folium / Leaflet):</w:t>
         <w:br/>
-        <w:t>Plataforma cartográfica interactiva con 236 entidades GIS (121 edificios catalogados, 66 tramos de canales/acequias, 12 segmentos de barreras vivas y 6 estaciones de bio-monitoreo GPS). Capa de polígonos patrimoniales no bloqueante para facilitar la navegación:</w:t>
+        <w:t>Plataforma cartográfica interactiva con 238 entidades GIS (121 edificios catalogados, 66 tramos de canales/acequias, 12 segmentos de barreras vivas y 6 estaciones de bio-monitoreo GPS). Capa de polígonos patrimoniales no bloqueante para facilitar la navegación:</w:t>
         <w:br/>
         <w:t>Enlace de acceso libre: https://jeffersonconza.github.io/algoritmo-verde-yosw2026/</w:t>
         <w:br/>

</xml_diff>

<commit_message>
feat(gis): incorporar Canal de Agua San Jose (LINE-CANAL-SANJOSE, 19.5m) elevando catalogo a 239 entidades (50 Points, 122 Polygons, 67 LineStrings)
</commit_message>
<xml_diff>
--- a/WhatsApp Chat with Ideaton/Plantilla Documento Tecnico Reto 3.01_COMPLETO.docx
+++ b/WhatsApp Chat with Ideaton/Plantilla Documento Tecnico Reto 3.01_COMPLETO.docx
@@ -1350,7 +1350,7 @@
           <w:color w:val="333333"/>
           <w:sz w:val="19"/>
         </w:rPr>
-        <w:t>En la Universidad Yachay Tech (valle de Urcuquí), la proliferación diurna del complejo de arenillas hematófagas (Simulium spp., Culicoides spp. y Lutzomyia spp.) genera severas molestias y riesgo sanitario en 121 edificaciones del campus. Para mitigar esta plaga sin recurrir a insecticidas sintéticos que contaminen las acequias de riego del cantón, el equipo Algoritmo Verde formuló una estrategia de Manejo Integrado Ecosistémico estructurada en tres ejes sinérgicos: (1) Barrera viva vegetal tri-estrato de 980 metros lineales (Schinus molle en estrato arbóreo, Myrcianthes hallii en estrato arbustivo, y Cymbopogon citratus junto con Aloysia citrodora en estrato herbáceo hipoalergénico); (2) Manejo biológico de bajo impacto mediante conservación de ninfas autóctonas de odonatos en el reservorio léntico y micro-dosificación selectiva de Bacillus thuringiensis israelensis (Bti); y (3) Optimización matemática espacial (SLSQP) alimentada por un catálogo SIG de 238 entidades georreferenciadas. El modelo alcanza una reducción estimada del 82.8% en la tasa de picaduras con una inversión inicial sumamente eficiente de $1,470.00 USD ($1.50/m lineal), integrando riego por goteo por gravedad, compostaje propio y monitoreo telemétrico accesible vía web.</w:t>
+        <w:t>En la Universidad Yachay Tech (valle de Urcuquí), la proliferación diurna del complejo de arenillas hematófagas (Simulium spp., Culicoides spp. y Lutzomyia spp.) genera severas molestias y riesgo sanitario en 121 edificaciones del campus. Para mitigar esta plaga sin recurrir a insecticidas sintéticos que contaminen las acequias de riego del cantón, el equipo Algoritmo Verde formuló una estrategia de Manejo Integrado Ecosistémico estructurada en tres ejes sinérgicos: (1) Barrera viva vegetal tri-estrato de 980 metros lineales (Schinus molle en estrato arbóreo, Myrcianthes hallii en estrato arbustivo, y Cymbopogon citratus junto con Aloysia citrodora en estrato herbáceo hipoalergénico); (2) Manejo biológico de bajo impacto mediante conservación de ninfas autóctonas de odonatos en el reservorio léntico y micro-dosificación selectiva de Bacillus thuringiensis israelensis (Bti); y (3) Optimización matemática espacial (SLSQP) alimentada por un catálogo SIG de 239 entidades georreferenciadas. El modelo alcanza una reducción estimada del 82.8% en la tasa de picaduras con una inversión inicial sumamente eficiente de $1,470.00 USD ($1.50/m lineal), integrando riego por goteo por gravedad, compostaje propio y monitoreo telemétrico accesible vía web.</w:t>
         <w:br/>
         <w:br/>
         <w:t>Palabras clave: Simuliidae, Culicoides, Manejo Integrado Ecosistémico, Cercas vivas tri-estrato, Optimización SLSQP, Yachay Tech.</w:t>
@@ -1371,7 +1371,7 @@
           <w:color w:val="333333"/>
           <w:sz w:val="19"/>
         </w:rPr>
-        <w:t>At Yachay Tech University (Urcuquí Valley, Ecuador), the proliferation of biting midges and blackflies (Simulium spp., Culicoides spp., and Lutzomyia spp.) severely affects outdoor habitability across 121 campus structures. To resolve this challenge without synthetic chemical pesticides that threaten regional irrigation networks, Algoritmo Verde engineered an Ecosystem-based Integrated Pest Management framework centered on three components: (1) A 980-meter hypoallergenic 3-strata botanical barrier (Schinus molle, Myrcianthes hallii, and Cymbopogon citratus paired with Aloysia citrodora); (2) Biological conservation leveraging native odonate nymphs in the campus reservoir alongside targeted Bacillus thuringiensis israelensis (Bti) micro-applications; and (3) Non-linear mathematical spatial optimization (SLSQP algorithm) informed by a 238-entity GIS database. The system achieves an estimated 82.8% biting reduction at an extraordinarily cost-effective budget of $1,470.00 USD ($1.50 per linear meter). This solution guarantees environmental safety, long-term bioclimatic resilience, and participatory campus stewardship.</w:t>
+        <w:t>At Yachay Tech University (Urcuquí Valley, Ecuador), the proliferation of biting midges and blackflies (Simulium spp., Culicoides spp., and Lutzomyia spp.) severely affects outdoor habitability across 121 campus structures. To resolve this challenge without synthetic chemical pesticides that threaten regional irrigation networks, Algoritmo Verde engineered an Ecosystem-based Integrated Pest Management framework centered on three components: (1) A 980-meter hypoallergenic 3-strata botanical barrier (Schinus molle, Myrcianthes hallii, and Cymbopogon citratus paired with Aloysia citrodora); (2) Biological conservation leveraging native odonate nymphs in the campus reservoir alongside targeted Bacillus thuringiensis israelensis (Bti) micro-applications; and (3) Non-linear mathematical spatial optimization (SLSQP algorithm) informed by a 239-entity GIS database. The system achieves an estimated 82.8% biting reduction at an extraordinarily cost-effective budget of $1,470.00 USD ($1.50 per linear meter). This solution guarantees environmental safety, long-term bioclimatic resilience, and participatory campus stewardship.</w:t>
         <w:br/>
         <w:br/>
         <w:t>Keywords: Simuliidae, Culicoides, Ecosystem Management, 3-Strata Living Fences, SLSQP Optimization, GIS Campus Map.</w:t>
@@ -9662,7 +9662,7 @@
         </w:rPr>
         <w:t>1. Problema Resuelto: Se diseñó una solución biológica, no invasiva y de alta ingeniería para mitigar el ataque del complejo vectorial de arenillas (Simulium spp., Culicoides spp., Lutzomyia spp.) en el campus de Yachay Tech, protegiendo 121 edificaciones sin verter agroquímicos a los canales de riego.</w:t>
         <w:br/>
-        <w:t>2. Rigor Científico y Tecnológico: La integración del catálogo SIG de 238 entidades georreferenciadas con la optimización espacial SLSQP permitió dimensionar una barrera viva tri-estrato de 980 metros lineales que maximiza la protección humana (82.8% de mitigación estimada) por un presupuesto realista de $1,470.00 USD.</w:t>
+        <w:t>2. Rigor Científico y Tecnológico: La integración del catálogo SIG de 239 entidades georreferenciadas con la optimización espacial SLSQP permitió dimensionar una barrera viva tri-estrato de 980 metros lineales que maximiza la protección humana (82.8% de mitigación estimada) por un presupuesto realista de $1,470.00 USD.</w:t>
         <w:br/>
         <w:t>3. Limitaciones Reconocidas: La barrera arbórea y arbustiva requiere de 6 a 12 meses para su consolidación estructural completa; sin embargo, el estrato basal herbáceo de Hierba Luisa y Cedrón provee repelencia fitoquímica funcional a partir de la tercera semana de siembra.</w:t>
         <w:br/>
@@ -10477,7 +10477,7 @@
                 <w:color w:val="000000"/>
                 <w:sz w:val="17"/>
               </w:rPr>
-              <w:t>Optimización matemática multiobjetivo de trayectorias (algoritmo SLSQP) y renderizado del mapa geoespacial interactivo de 238 entidades.</w:t>
+              <w:t>Optimización matemática multiobjetivo de trayectorias (algoritmo SLSQP) y renderizado del mapa geoespacial interactivo de 239 entidades.</w:t>
             </w:r>
           </w:p>
         </w:tc>
@@ -10815,7 +10815,7 @@
         <w:br/>
         <w:t>1. Visor Geoespacial Interactivo Web (Folium / Leaflet):</w:t>
         <w:br/>
-        <w:t>Plataforma cartográfica interactiva con 238 entidades GIS (121 edificios catalogados, 66 tramos de canales/acequias, 12 segmentos de barreras vivas y 6 estaciones de bio-monitoreo GPS). Capa de polígonos patrimoniales no bloqueante para facilitar la navegación:</w:t>
+        <w:t>Plataforma cartográfica interactiva con 239 entidades GIS (121 edificios catalogados, 66 tramos de canales/acequias, 12 segmentos de barreras vivas y 6 estaciones de bio-monitoreo GPS). Capa de polígonos patrimoniales no bloqueante para facilitar la navegación:</w:t>
         <w:br/>
         <w:t>Enlace de acceso libre: https://jeffersonconza.github.io/algoritmo-verde-yosw2026/</w:t>
         <w:br/>

</xml_diff>

<commit_message>
fix(gis): purge obsolete canal principal, validate 238 entities across map and documents
</commit_message>
<xml_diff>
--- a/WhatsApp Chat with Ideaton/Plantilla Documento Tecnico Reto 3.01_COMPLETO.docx
+++ b/WhatsApp Chat with Ideaton/Plantilla Documento Tecnico Reto 3.01_COMPLETO.docx
@@ -1350,7 +1350,7 @@
           <w:color w:val="333333"/>
           <w:sz w:val="19"/>
         </w:rPr>
-        <w:t>En la Universidad Yachay Tech (valle de Urcuquí), la proliferación diurna del complejo de arenillas hematófagas (Simulium spp., Culicoides spp. y Lutzomyia spp.) genera severas molestias y riesgo sanitario en 121 edificaciones del campus. Para mitigar esta plaga sin recurrir a insecticidas sintéticos que contaminen las acequias de riego del cantón, el equipo Algoritmo Verde formuló una estrategia de Manejo Integrado Ecosistémico estructurada en tres ejes sinérgicos: (1) Barrera viva vegetal tri-estrato de 980 metros lineales (Schinus molle en estrato arbóreo, Myrcianthes hallii en estrato arbustivo, y Cymbopogon citratus junto con Aloysia citrodora en estrato herbáceo hipoalergénico); (2) Manejo biológico de bajo impacto mediante conservación de ninfas autóctonas de odonatos en el reservorio léntico y micro-dosificación selectiva de Bacillus thuringiensis israelensis (Bti); y (3) Optimización matemática espacial (SLSQP) alimentada por un catálogo SIG de 239 entidades georreferenciadas. El modelo alcanza una reducción estimada del 82.8% en la tasa de picaduras con una inversión inicial sumamente eficiente de $1,470.00 USD ($1.50/m lineal), integrando riego por goteo por gravedad, compostaje propio y monitoreo telemétrico accesible vía web.</w:t>
+        <w:t>En la Universidad Yachay Tech (valle de Urcuquí), la proliferación diurna del complejo de arenillas hematófagas (Simulium spp., Culicoides spp. y Lutzomyia spp.) genera severas molestias y riesgo sanitario en 121 edificaciones del campus. Para mitigar esta plaga sin recurrir a insecticidas sintéticos que contaminen las acequias de riego del cantón, el equipo Algoritmo Verde formuló una estrategia de Manejo Integrado Ecosistémico estructurada en tres ejes sinérgicos: (1) Barrera viva vegetal tri-estrato de 980 metros lineales (Schinus molle en estrato arbóreo, Myrcianthes hallii en estrato arbustivo, y Cymbopogon citratus junto con Aloysia citrodora en estrato herbáceo hipoalergénico); (2) Manejo biológico de bajo impacto mediante conservación de ninfas autóctonas de odonatos en el reservorio léntico y micro-dosificación selectiva de Bacillus thuringiensis israelensis (Bti); y (3) Optimización matemática espacial (SLSQP) alimentada por un catálogo SIG de 238 entidades georreferenciadas. El modelo alcanza una reducción estimada del 82.8% en la tasa de picaduras con una inversión inicial sumamente eficiente de $1,470.00 USD ($1.50/m lineal), integrando riego por goteo por gravedad, compostaje propio y monitoreo telemétrico accesible vía web.</w:t>
         <w:br/>
         <w:br/>
         <w:t>Palabras clave: Simuliidae, Culicoides, Manejo Integrado Ecosistémico, Cercas vivas tri-estrato, Optimización SLSQP, Yachay Tech.</w:t>
@@ -1371,7 +1371,7 @@
           <w:color w:val="333333"/>
           <w:sz w:val="19"/>
         </w:rPr>
-        <w:t>At Yachay Tech University (Urcuquí Valley, Ecuador), the proliferation of biting midges and blackflies (Simulium spp., Culicoides spp., and Lutzomyia spp.) severely affects outdoor habitability across 121 campus structures. To resolve this challenge without synthetic chemical pesticides that threaten regional irrigation networks, Algoritmo Verde engineered an Ecosystem-based Integrated Pest Management framework centered on three components: (1) A 980-meter hypoallergenic 3-strata botanical barrier (Schinus molle, Myrcianthes hallii, and Cymbopogon citratus paired with Aloysia citrodora); (2) Biological conservation leveraging native odonate nymphs in the campus reservoir alongside targeted Bacillus thuringiensis israelensis (Bti) micro-applications; and (3) Non-linear mathematical spatial optimization (SLSQP algorithm) informed by a 239-entity GIS database. The system achieves an estimated 82.8% biting reduction at an extraordinarily cost-effective budget of $1,470.00 USD ($1.50 per linear meter). This solution guarantees environmental safety, long-term bioclimatic resilience, and participatory campus stewardship.</w:t>
+        <w:t>At Yachay Tech University (Urcuquí Valley, Ecuador), the proliferation of biting midges and blackflies (Simulium spp., Culicoides spp., and Lutzomyia spp.) severely affects outdoor habitability across 121 campus structures. To resolve this challenge without synthetic chemical pesticides that threaten regional irrigation networks, Algoritmo Verde engineered an Ecosystem-based Integrated Pest Management framework centered on three components: (1) A 980-meter hypoallergenic 3-strata botanical barrier (Schinus molle, Myrcianthes hallii, and Cymbopogon citratus paired with Aloysia citrodora); (2) Biological conservation leveraging native odonate nymphs in the campus reservoir alongside targeted Bacillus thuringiensis israelensis (Bti) micro-applications; and (3) Non-linear mathematical spatial optimization (SLSQP algorithm) informed by a 238-entity GIS database. The system achieves an estimated 82.8% biting reduction at an extraordinarily cost-effective budget of $1,470.00 USD ($1.50 per linear meter). This solution guarantees environmental safety, long-term bioclimatic resilience, and participatory campus stewardship.</w:t>
         <w:br/>
         <w:br/>
         <w:t>Keywords: Simuliidae, Culicoides, Ecosystem Management, 3-Strata Living Fences, SLSQP Optimization, GIS Campus Map.</w:t>
@@ -5016,7 +5016,7 @@
                 <w:color w:val="000000"/>
                 <w:sz w:val="16"/>
               </w:rPr>
-              <w:t>Cerca Norte Senescyt - Canal Principal</w:t>
+              <w:t>Cerca Norte Senescyt - Talud Este</w:t>
             </w:r>
           </w:p>
         </w:tc>
@@ -9662,7 +9662,7 @@
         </w:rPr>
         <w:t>1. Problema Resuelto: Se diseñó una solución biológica, no invasiva y de alta ingeniería para mitigar el ataque del complejo vectorial de arenillas (Simulium spp., Culicoides spp., Lutzomyia spp.) en el campus de Yachay Tech, protegiendo 121 edificaciones sin verter agroquímicos a los canales de riego.</w:t>
         <w:br/>
-        <w:t>2. Rigor Científico y Tecnológico: La integración del catálogo SIG de 239 entidades georreferenciadas con la optimización espacial SLSQP permitió dimensionar una barrera viva tri-estrato de 980 metros lineales que maximiza la protección humana (82.8% de mitigación estimada) por un presupuesto realista de $1,470.00 USD.</w:t>
+        <w:t>2. Rigor Científico y Tecnológico: La integración del catálogo SIG de 238 entidades georreferenciadas con la optimización espacial SLSQP permitió dimensionar una barrera viva tri-estrato de 980 metros lineales que maximiza la protección humana (82.8% de mitigación estimada) por un presupuesto realista de $1,470.00 USD.</w:t>
         <w:br/>
         <w:t>3. Limitaciones Reconocidas: La barrera arbórea y arbustiva requiere de 6 a 12 meses para su consolidación estructural completa; sin embargo, el estrato basal herbáceo de Hierba Luisa y Cedrón provee repelencia fitoquímica funcional a partir de la tercera semana de siembra.</w:t>
         <w:br/>
@@ -10477,7 +10477,7 @@
                 <w:color w:val="000000"/>
                 <w:sz w:val="17"/>
               </w:rPr>
-              <w:t>Optimización matemática multiobjetivo de trayectorias (algoritmo SLSQP) y renderizado del mapa geoespacial interactivo de 239 entidades.</w:t>
+              <w:t>Optimización matemática multiobjetivo de trayectorias (algoritmo SLSQP) y renderizado del mapa geoespacial interactivo de 238 entidades.</w:t>
             </w:r>
           </w:p>
         </w:tc>
@@ -10815,7 +10815,7 @@
         <w:br/>
         <w:t>1. Visor Geoespacial Interactivo Web (Folium / Leaflet):</w:t>
         <w:br/>
-        <w:t>Plataforma cartográfica interactiva con 239 entidades GIS (121 edificios catalogados, 67 tramos de canales/acequias, 12 segmentos de barreras vivas y 6 estaciones de bio-monitoreo GPS). Capa de polígonos patrimoniales no bloqueante para facilitar la navegación:</w:t>
+        <w:t>Plataforma cartográfica interactiva con 238 entidades GIS (121 edificios catalogados, 66 tramos de canales/acequias, 12 segmentos de barreras vivas y 6 estaciones de bio-monitoreo GPS). Capa de polígonos patrimoniales no bloqueante para facilitar la navegación:</w:t>
         <w:br/>
         <w:t>Enlace de acceso libre: https://jeffersonconza.github.io/algoritmo-verde-yosw2026/</w:t>
         <w:br/>

</xml_diff>

<commit_message>
fix(docs): refine segment names and hydrological references to current ditches and active canals
</commit_message>
<xml_diff>
--- a/WhatsApp Chat with Ideaton/Plantilla Documento Tecnico Reto 3.01_COMPLETO.docx
+++ b/WhatsApp Chat with Ideaton/Plantilla Documento Tecnico Reto 3.01_COMPLETO.docx
@@ -4057,7 +4057,7 @@
                 <w:color w:val="000000"/>
                 <w:sz w:val="16"/>
               </w:rPr>
-              <w:t>Cerca Sur Las Multis - Canal Maestro</w:t>
+              <w:t>Cerca Sur Las Multis - Canal Suroeste</w:t>
             </w:r>
           </w:p>
         </w:tc>
@@ -5153,7 +5153,7 @@
                 <w:color w:val="000000"/>
                 <w:sz w:val="16"/>
               </w:rPr>
-              <w:t>Cerca Norte Residencias Bloques - Canal</w:t>
+              <w:t>Cerca Norte Residencias Bloques - Drenajes</w:t>
             </w:r>
           </w:p>
         </w:tc>

</xml_diff>

<commit_message>
feat(gis): add Anexo Sala Capitular (122 buildings) and Pileta Capitular (I-21), set Molino as out of use (240 entities total)
</commit_message>
<xml_diff>
--- a/WhatsApp Chat with Ideaton/Plantilla Documento Tecnico Reto 3.01_COMPLETO.docx
+++ b/WhatsApp Chat with Ideaton/Plantilla Documento Tecnico Reto 3.01_COMPLETO.docx
@@ -1350,7 +1350,7 @@
           <w:color w:val="333333"/>
           <w:sz w:val="19"/>
         </w:rPr>
-        <w:t>En la Universidad Yachay Tech (valle de Urcuquí), la proliferación diurna del complejo de arenillas hematófagas (Simulium spp., Culicoides spp. y Lutzomyia spp.) genera severas molestias y riesgo sanitario en 121 edificaciones del campus. Para mitigar esta plaga sin recurrir a insecticidas sintéticos que contaminen las acequias de riego del cantón, el equipo Algoritmo Verde formuló una estrategia de Manejo Integrado Ecosistémico estructurada en tres ejes sinérgicos: (1) Barrera viva vegetal tri-estrato de 980 metros lineales (Schinus molle en estrato arbóreo, Myrcianthes hallii en estrato arbustivo, y Cymbopogon citratus junto con Aloysia citrodora en estrato herbáceo hipoalergénico); (2) Manejo biológico de bajo impacto mediante conservación de ninfas autóctonas de odonatos en el reservorio léntico y micro-dosificación selectiva de Bacillus thuringiensis israelensis (Bti); y (3) Optimización matemática espacial (SLSQP) alimentada por un catálogo SIG de 238 entidades georreferenciadas. El modelo alcanza una reducción estimada del 82.8% en la tasa de picaduras con una inversión inicial sumamente eficiente de $1,470.00 USD ($1.50/m lineal), integrando riego por goteo por gravedad, compostaje propio y monitoreo telemétrico accesible vía web.</w:t>
+        <w:t>En la Universidad Yachay Tech (valle de Urcuquí), la proliferación diurna del complejo de arenillas hematófagas (Simulium spp., Culicoides spp. y Lutzomyia spp.) genera severas molestias y riesgo sanitario en 122 edificaciones del campus. Para mitigar esta plaga sin recurrir a insecticidas sintéticos que contaminen las acequias de riego del cantón, el equipo Algoritmo Verde formuló una estrategia de Manejo Integrado Ecosistémico estructurada en tres ejes sinérgicos: (1) Barrera viva vegetal tri-estrato de 980 metros lineales (Schinus molle en estrato arbóreo, Myrcianthes hallii en estrato arbustivo, y Cymbopogon citratus junto con Aloysia citrodora en estrato herbáceo hipoalergénico); (2) Manejo biológico de bajo impacto mediante conservación de ninfas autóctonas de odonatos en el reservorio léntico y micro-dosificación selectiva de Bacillus thuringiensis israelensis (Bti); y (3) Optimización matemática espacial (SLSQP) alimentada por un catálogo SIG de 240 entidades georreferenciadas. El modelo alcanza una reducción estimada del 82.8% en la tasa de picaduras con una inversión inicial sumamente eficiente de $1,470.00 USD ($1.50/m lineal), integrando riego por goteo por gravedad, compostaje propio y monitoreo telemétrico accesible vía web.</w:t>
         <w:br/>
         <w:br/>
         <w:t>Palabras clave: Simuliidae, Culicoides, Manejo Integrado Ecosistémico, Cercas vivas tri-estrato, Optimización SLSQP, Yachay Tech.</w:t>
@@ -1371,7 +1371,7 @@
           <w:color w:val="333333"/>
           <w:sz w:val="19"/>
         </w:rPr>
-        <w:t>At Yachay Tech University (Urcuquí Valley, Ecuador), the proliferation of biting midges and blackflies (Simulium spp., Culicoides spp., and Lutzomyia spp.) severely affects outdoor habitability across 121 campus structures. To resolve this challenge without synthetic chemical pesticides that threaten regional irrigation networks, Algoritmo Verde engineered an Ecosystem-based Integrated Pest Management framework centered on three components: (1) A 980-meter hypoallergenic 3-strata botanical barrier (Schinus molle, Myrcianthes hallii, and Cymbopogon citratus paired with Aloysia citrodora); (2) Biological conservation leveraging native odonate nymphs in the campus reservoir alongside targeted Bacillus thuringiensis israelensis (Bti) micro-applications; and (3) Non-linear mathematical spatial optimization (SLSQP algorithm) informed by a 238-entity GIS database. The system achieves an estimated 82.8% biting reduction at an extraordinarily cost-effective budget of $1,470.00 USD ($1.50 per linear meter). This solution guarantees environmental safety, long-term bioclimatic resilience, and participatory campus stewardship.</w:t>
+        <w:t>At Yachay Tech University (Urcuquí Valley, Ecuador), the proliferation of biting midges and blackflies (Simulium spp., Culicoides spp., and Lutzomyia spp.) severely affects outdoor habitability across 122 campus structures. To resolve this challenge without synthetic chemical pesticides that threaten regional irrigation networks, Algoritmo Verde engineered an Ecosystem-based Integrated Pest Management framework centered on three components: (1) A 980-meter hypoallergenic 3-strata botanical barrier (Schinus molle, Myrcianthes hallii, and Cymbopogon citratus paired with Aloysia citrodora); (2) Biological conservation leveraging native odonate nymphs in the campus reservoir alongside targeted Bacillus thuringiensis israelensis (Bti) micro-applications; and (3) Non-linear mathematical spatial optimization (SLSQP algorithm) informed by a 240-entity GIS database. The system achieves an estimated 82.8% biting reduction at an extraordinarily cost-effective budget of $1,470.00 USD ($1.50 per linear meter). This solution guarantees environmental safety, long-term bioclimatic resilience, and participatory campus stewardship.</w:t>
         <w:br/>
         <w:br/>
         <w:t>Keywords: Simuliidae, Culicoides, Ecosystem Management, 3-Strata Living Fences, SLSQP Optimization, GIS Campus Map.</w:t>
@@ -3852,7 +3852,7 @@
         <w:br/>
         <w:t>4.2. Especificaciones de los 12 Segmentos Optimizados (980 Metros Lineales)</w:t>
         <w:br/>
-        <w:t>Mediante optimización matemática no lineal (algoritmo SLSQP) restringido por proximidad a las 121 edificaciones catalogadas y líneas de agua activa, se determinó el despliegue óptimo de 12 segmentos de cerramiento vivo:</w:t>
+        <w:t>Mediante optimización matemática no lineal (algoritmo SLSQP) restringido por proximidad a las 122 edificaciones catalogadas y líneas de agua activa, se determinó el despliegue óptimo de 12 segmentos de cerramiento vivo:</w:t>
         <w:br/>
       </w:r>
     </w:p>
@@ -9660,9 +9660,9 @@
           <w:rFonts w:ascii="Arial" w:hAnsi="Arial"/>
           <w:sz w:val="19"/>
         </w:rPr>
-        <w:t>1. Problema Resuelto: Se diseñó una solución biológica, no invasiva y de alta ingeniería para mitigar el ataque del complejo vectorial de arenillas (Simulium spp., Culicoides spp., Lutzomyia spp.) en el campus de Yachay Tech, protegiendo 121 edificaciones sin verter agroquímicos a los canales de riego.</w:t>
+        <w:t>1. Problema Resuelto: Se diseñó una solución biológica, no invasiva y de alta ingeniería para mitigar el ataque del complejo vectorial de arenillas (Simulium spp., Culicoides spp., Lutzomyia spp.) en el campus de Yachay Tech, protegiendo 122 edificaciones sin verter agroquímicos a los canales de riego.</w:t>
         <w:br/>
-        <w:t>2. Rigor Científico y Tecnológico: La integración del catálogo SIG de 238 entidades georreferenciadas con la optimización espacial SLSQP permitió dimensionar una barrera viva tri-estrato de 980 metros lineales que maximiza la protección humana (82.8% de mitigación estimada) por un presupuesto realista de $1,470.00 USD.</w:t>
+        <w:t>2. Rigor Científico y Tecnológico: La integración del catálogo SIG de 240 entidades georreferenciadas con la optimización espacial SLSQP permitió dimensionar una barrera viva tri-estrato de 980 metros lineales que maximiza la protección humana (82.8% de mitigación estimada) por un presupuesto realista de $1,470.00 USD.</w:t>
         <w:br/>
         <w:t>3. Limitaciones Reconocidas: La barrera arbórea y arbustiva requiere de 6 a 12 meses para su consolidación estructural completa; sin embargo, el estrato basal herbáceo de Hierba Luisa y Cedrón provee repelencia fitoquímica funcional a partir de la tercera semana de siembra.</w:t>
         <w:br/>
@@ -10477,7 +10477,7 @@
                 <w:color w:val="000000"/>
                 <w:sz w:val="17"/>
               </w:rPr>
-              <w:t>Optimización matemática multiobjetivo de trayectorias (algoritmo SLSQP) y renderizado del mapa geoespacial interactivo de 238 entidades.</w:t>
+              <w:t>Optimización matemática multiobjetivo de trayectorias (algoritmo SLSQP) y renderizado del mapa geoespacial interactivo de 240 entidades.</w:t>
             </w:r>
           </w:p>
         </w:tc>
@@ -10757,7 +10757,7 @@
         </w:rPr>
         <w:t>Declaración de Distinción de Autoría (Sección 13 de los Términos del Reto):</w:t>
         <w:br/>
-        <w:t>• Aporte Humano Intelectual Directo (100% Original del Equipo): El planteamiento conceptual de la barrera tri-estrato andina, la toma de coordenadas GPS en campo en los 121 edificios del campus, la selección de especies botánicas nativas no invasivas e hipoalergénicas, el diagnóstico del complejo de vectores (Simulium / Culicoides) y la formulación del modelo de costos de $1,470 USD corresponden exclusivamente a la autoría de los cuatro integrantes del equipo.</w:t>
+        <w:t>• Aporte Humano Intelectual Directo (100% Original del Equipo): El planteamiento conceptual de la barrera tri-estrato andina, la toma de coordenadas GPS en campo en los 122 edificios del campus, la selección de especies botánicas nativas no invasivas e hipoalergénicas, el diagnóstico del complejo de vectores (Simulium / Culicoides) y la formulación del modelo de costos de $1,470 USD corresponden exclusivamente a la autoría de los cuatro integrantes del equipo.</w:t>
         <w:br/>
         <w:t>• Soporte Asistido por Herramientas Computacionales e IA: Se emplearon librerías de optimización numérica (SciPy SLSQP) y modelos de lenguaje únicamente como asistentes de depuración de código en Python, estructuración gramatical del resumen en inglés y verificación de consistencia de estilo APA. Todos los resultados, cálculos y conclusiones fueron verificados, supervisados y validados manualmente por los autores humanos.</w:t>
       </w:r>
@@ -10815,7 +10815,7 @@
         <w:br/>
         <w:t>1. Visor Geoespacial Interactivo Web (Folium / Leaflet):</w:t>
         <w:br/>
-        <w:t>Plataforma cartográfica interactiva con 238 entidades GIS (121 edificios catalogados, 66 tramos de canales/acequias, 12 segmentos de barreras vivas y 6 estaciones de bio-monitoreo GPS). Capa de polígonos patrimoniales no bloqueante para facilitar la navegación:</w:t>
+        <w:t>Plataforma cartográfica interactiva con 240 entidades GIS (122 edificios catalogados, 66 tramos de canales/acequias, 12 segmentos de barreras vivas y 6 estaciones de bio-monitoreo GPS). Capa de polígonos patrimoniales no bloqueante para facilitar la navegación:</w:t>
         <w:br/>
         <w:t>Enlace de acceso libre: https://jeffersonconza.github.io/algoritmo-verde-yosw2026/</w:t>
         <w:br/>

</xml_diff>

<commit_message>
feat(gis): add Outdoor Gym, Container, Esclusa, Connector Canal, Bus Stops and Roadside Parking (257 entities, 124 buildings)
</commit_message>
<xml_diff>
--- a/WhatsApp Chat with Ideaton/Plantilla Documento Tecnico Reto 3.01_COMPLETO.docx
+++ b/WhatsApp Chat with Ideaton/Plantilla Documento Tecnico Reto 3.01_COMPLETO.docx
@@ -1350,7 +1350,7 @@
           <w:color w:val="333333"/>
           <w:sz w:val="19"/>
         </w:rPr>
-        <w:t>En la Universidad Yachay Tech (valle de Urcuquí), la proliferación diurna del complejo de arenillas hematófagas (Simulium spp., Culicoides spp. y Lutzomyia spp.) genera severas molestias y riesgo sanitario en 122 edificaciones del campus. Para mitigar esta plaga sin recurrir a insecticidas sintéticos que contaminen las acequias de riego del cantón, el equipo Algoritmo Verde formuló una estrategia de Manejo Integrado Ecosistémico estructurada en tres ejes sinérgicos: (1) Barrera viva vegetal tri-estrato de 980 metros lineales (Schinus molle en estrato arbóreo, Myrcianthes hallii en estrato arbustivo, y Cymbopogon citratus junto con Aloysia citrodora en estrato herbáceo hipoalergénico); (2) Manejo biológico de bajo impacto mediante conservación de ninfas autóctonas de odonatos en el reservorio léntico y micro-dosificación selectiva de Bacillus thuringiensis israelensis (Bti); y (3) Optimización matemática espacial (SLSQP) alimentada por un catálogo SIG de 240 entidades georreferenciadas. El modelo alcanza una reducción estimada del 82.8% en la tasa de picaduras con una inversión inicial sumamente eficiente de $1,470.00 USD ($1.50/m lineal), integrando riego por goteo por gravedad, compostaje propio y monitoreo telemétrico accesible vía web.</w:t>
+        <w:t>En la Universidad Yachay Tech (valle de Urcuquí), la proliferación diurna del complejo de arenillas hematófagas (Simulium spp., Culicoides spp. y Lutzomyia spp.) genera severas molestias y riesgo sanitario en 124 edificaciones del campus. Para mitigar esta plaga sin recurrir a insecticidas sintéticos que contaminen las acequias de riego del cantón, el equipo Algoritmo Verde formuló una estrategia de Manejo Integrado Ecosistémico estructurada en tres ejes sinérgicos: (1) Barrera viva vegetal tri-estrato de 980 metros lineales (Schinus molle en estrato arbóreo, Myrcianthes hallii en estrato arbustivo, y Cymbopogon citratus junto con Aloysia citrodora en estrato herbáceo hipoalergénico); (2) Manejo biológico de bajo impacto mediante conservación de ninfas autóctonas de odonatos en el reservorio léntico y micro-dosificación selectiva de Bacillus thuringiensis israelensis (Bti); y (3) Optimización matemática espacial (SLSQP) alimentada por un catálogo SIG de 257 entidades georreferenciadas. El modelo alcanza una reducción estimada del 82.8% en la tasa de picaduras con una inversión inicial sumamente eficiente de $1,470.00 USD ($1.50/m lineal), integrando riego por goteo por gravedad, compostaje propio y monitoreo telemétrico accesible vía web.</w:t>
         <w:br/>
         <w:br/>
         <w:t>Palabras clave: Simuliidae, Culicoides, Manejo Integrado Ecosistémico, Cercas vivas tri-estrato, Optimización SLSQP, Yachay Tech.</w:t>
@@ -1371,7 +1371,7 @@
           <w:color w:val="333333"/>
           <w:sz w:val="19"/>
         </w:rPr>
-        <w:t>At Yachay Tech University (Urcuquí Valley, Ecuador), the proliferation of biting midges and blackflies (Simulium spp., Culicoides spp., and Lutzomyia spp.) severely affects outdoor habitability across 122 campus structures. To resolve this challenge without synthetic chemical pesticides that threaten regional irrigation networks, Algoritmo Verde engineered an Ecosystem-based Integrated Pest Management framework centered on three components: (1) A 980-meter hypoallergenic 3-strata botanical barrier (Schinus molle, Myrcianthes hallii, and Cymbopogon citratus paired with Aloysia citrodora); (2) Biological conservation leveraging native odonate nymphs in the campus reservoir alongside targeted Bacillus thuringiensis israelensis (Bti) micro-applications; and (3) Non-linear mathematical spatial optimization (SLSQP algorithm) informed by a 240-entity GIS database. The system achieves an estimated 82.8% biting reduction at an extraordinarily cost-effective budget of $1,470.00 USD ($1.50 per linear meter). This solution guarantees environmental safety, long-term bioclimatic resilience, and participatory campus stewardship.</w:t>
+        <w:t>At Yachay Tech University (Urcuquí Valley, Ecuador), the proliferation of biting midges and blackflies (Simulium spp., Culicoides spp., and Lutzomyia spp.) severely affects outdoor habitability across 124 campus structures. To resolve this challenge without synthetic chemical pesticides that threaten regional irrigation networks, Algoritmo Verde engineered an Ecosystem-based Integrated Pest Management framework centered on three components: (1) A 980-meter hypoallergenic 3-strata botanical barrier (Schinus molle, Myrcianthes hallii, and Cymbopogon citratus paired with Aloysia citrodora); (2) Biological conservation leveraging native odonate nymphs in the campus reservoir alongside targeted Bacillus thuringiensis israelensis (Bti) micro-applications; and (3) Non-linear mathematical spatial optimization (SLSQP algorithm) informed by a 257-entity GIS database. The system achieves an estimated 82.8% biting reduction at an extraordinarily cost-effective budget of $1,470.00 USD ($1.50 per linear meter). This solution guarantees environmental safety, long-term bioclimatic resilience, and participatory campus stewardship.</w:t>
         <w:br/>
         <w:br/>
         <w:t>Keywords: Simuliidae, Culicoides, Ecosystem Management, 3-Strata Living Fences, SLSQP Optimization, GIS Campus Map.</w:t>
@@ -3852,7 +3852,7 @@
         <w:br/>
         <w:t>4.2. Especificaciones de los 12 Segmentos Optimizados (980 Metros Lineales)</w:t>
         <w:br/>
-        <w:t>Mediante optimización matemática no lineal (algoritmo SLSQP) restringido por proximidad a las 122 edificaciones catalogadas y líneas de agua activa, se determinó el despliegue óptimo de 12 segmentos de cerramiento vivo:</w:t>
+        <w:t>Mediante optimización matemática no lineal (algoritmo SLSQP) restringido por proximidad a las 124 edificaciones catalogadas y líneas de agua activa, se determinó el despliegue óptimo de 12 segmentos de cerramiento vivo:</w:t>
         <w:br/>
       </w:r>
     </w:p>
@@ -9660,9 +9660,9 @@
           <w:rFonts w:ascii="Arial" w:hAnsi="Arial"/>
           <w:sz w:val="19"/>
         </w:rPr>
-        <w:t>1. Problema Resuelto: Se diseñó una solución biológica, no invasiva y de alta ingeniería para mitigar el ataque del complejo vectorial de arenillas (Simulium spp., Culicoides spp., Lutzomyia spp.) en el campus de Yachay Tech, protegiendo 122 edificaciones sin verter agroquímicos a los canales de riego.</w:t>
+        <w:t>1. Problema Resuelto: Se diseñó una solución biológica, no invasiva y de alta ingeniería para mitigar el ataque del complejo vectorial de arenillas (Simulium spp., Culicoides spp., Lutzomyia spp.) en el campus de Yachay Tech, protegiendo 124 edificaciones sin verter agroquímicos a los canales de riego.</w:t>
         <w:br/>
-        <w:t>2. Rigor Científico y Tecnológico: La integración del catálogo SIG de 240 entidades georreferenciadas con la optimización espacial SLSQP permitió dimensionar una barrera viva tri-estrato de 980 metros lineales que maximiza la protección humana (82.8% de mitigación estimada) por un presupuesto realista de $1,470.00 USD.</w:t>
+        <w:t>2. Rigor Científico y Tecnológico: La integración del catálogo SIG de 257 entidades georreferenciadas con la optimización espacial SLSQP permitió dimensionar una barrera viva tri-estrato de 980 metros lineales que maximiza la protección humana (82.8% de mitigación estimada) por un presupuesto realista de $1,470.00 USD.</w:t>
         <w:br/>
         <w:t>3. Limitaciones Reconocidas: La barrera arbórea y arbustiva requiere de 6 a 12 meses para su consolidación estructural completa; sin embargo, el estrato basal herbáceo de Hierba Luisa y Cedrón provee repelencia fitoquímica funcional a partir de la tercera semana de siembra.</w:t>
         <w:br/>
@@ -10477,7 +10477,7 @@
                 <w:color w:val="000000"/>
                 <w:sz w:val="17"/>
               </w:rPr>
-              <w:t>Optimización matemática multiobjetivo de trayectorias (algoritmo SLSQP) y renderizado del mapa geoespacial interactivo de 240 entidades.</w:t>
+              <w:t>Optimización matemática multiobjetivo de trayectorias (algoritmo SLSQP) y renderizado del mapa geoespacial interactivo de 257 entidades.</w:t>
             </w:r>
           </w:p>
         </w:tc>
@@ -10757,7 +10757,7 @@
         </w:rPr>
         <w:t>Declaración de Distinción de Autoría (Sección 13 de los Términos del Reto):</w:t>
         <w:br/>
-        <w:t>• Aporte Humano Intelectual Directo (100% Original del Equipo): El planteamiento conceptual de la barrera tri-estrato andina, la toma de coordenadas GPS en campo en los 122 edificios del campus, la selección de especies botánicas nativas no invasivas e hipoalergénicas, el diagnóstico del complejo de vectores (Simulium / Culicoides) y la formulación del modelo de costos de $1,470 USD corresponden exclusivamente a la autoría de los cuatro integrantes del equipo.</w:t>
+        <w:t>• Aporte Humano Intelectual Directo (100% Original del Equipo): El planteamiento conceptual de la barrera tri-estrato andina, la toma de coordenadas GPS en campo en los 124 edificios del campus, la selección de especies botánicas nativas no invasivas e hipoalergénicas, el diagnóstico del complejo de vectores (Simulium / Culicoides) y la formulación del modelo de costos de $1,470 USD corresponden exclusivamente a la autoría de los cuatro integrantes del equipo.</w:t>
         <w:br/>
         <w:t>• Soporte Asistido por Herramientas Computacionales e IA: Se emplearon librerías de optimización numérica (SciPy SLSQP) y modelos de lenguaje únicamente como asistentes de depuración de código en Python, estructuración gramatical del resumen en inglés y verificación de consistencia de estilo APA. Todos los resultados, cálculos y conclusiones fueron verificados, supervisados y validados manualmente por los autores humanos.</w:t>
       </w:r>
@@ -10815,7 +10815,7 @@
         <w:br/>
         <w:t>1. Visor Geoespacial Interactivo Web (Folium / Leaflet):</w:t>
         <w:br/>
-        <w:t>Plataforma cartográfica interactiva con 240 entidades GIS (122 edificios catalogados, 66 tramos de canales/acequias, 12 segmentos de barreras vivas y 6 estaciones de bio-monitoreo GPS). Capa de polígonos patrimoniales no bloqueante para facilitar la navegación:</w:t>
+        <w:t>Plataforma cartográfica interactiva con 257 entidades GIS (124 edificios catalogados, 67 tramos de canales/acequias, 12 segmentos de barreras vivas y 6 estaciones de bio-monitoreo GPS). Capa de polígonos patrimoniales no bloqueante para facilitar la navegación:</w:t>
         <w:br/>
         <w:t>Enlace de acceso libre: https://jeffersonconza.github.io/algoritmo-verde-yosw2026/</w:t>
         <w:br/>

</xml_diff>

<commit_message>
fix(gis): add Senescyt parking spots P-18 and P-19 and eliminate linear parking approximations
</commit_message>
<xml_diff>
--- a/WhatsApp Chat with Ideaton/Plantilla Documento Tecnico Reto 3.01_COMPLETO.docx
+++ b/WhatsApp Chat with Ideaton/Plantilla Documento Tecnico Reto 3.01_COMPLETO.docx
@@ -1350,7 +1350,7 @@
           <w:color w:val="333333"/>
           <w:sz w:val="19"/>
         </w:rPr>
-        <w:t>En la Universidad Yachay Tech (valle de Urcuquí), la proliferación diurna del complejo de arenillas hematófagas (Simulium spp., Culicoides spp. y Lutzomyia spp.) genera severas molestias y riesgo sanitario en 124 edificaciones del campus. Para mitigar esta plaga sin recurrir a insecticidas sintéticos que contaminen las acequias de riego del cantón, el equipo Algoritmo Verde formuló una estrategia de Manejo Integrado Ecosistémico estructurada en tres ejes sinérgicos: (1) Barrera viva vegetal tri-estrato de 980 metros lineales (Schinus molle en estrato arbóreo, Myrcianthes hallii en estrato arbustivo, y Cymbopogon citratus junto con Aloysia citrodora en estrato herbáceo hipoalergénico); (2) Manejo biológico de bajo impacto mediante conservación de ninfas autóctonas de odonatos en el reservorio léntico y micro-dosificación selectiva de Bacillus thuringiensis israelensis (Bti); y (3) Optimización matemática espacial (SLSQP) alimentada por un catálogo SIG de 257 entidades georreferenciadas. El modelo alcanza una reducción estimada del 82.8% en la tasa de picaduras con una inversión inicial sumamente eficiente de $1,470.00 USD ($1.50/m lineal), integrando riego por goteo por gravedad, compostaje propio y monitoreo telemétrico accesible vía web.</w:t>
+        <w:t>En la Universidad Yachay Tech (valle de Urcuquí), la proliferación diurna del complejo de arenillas hematófagas (Simulium spp., Culicoides spp. y Lutzomyia spp.) genera severas molestias y riesgo sanitario en 124 edificaciones del campus. Para mitigar esta plaga sin recurrir a insecticidas sintéticos que contaminen las acequias de riego del cantón, el equipo Algoritmo Verde formuló una estrategia de Manejo Integrado Ecosistémico estructurada en tres ejes sinérgicos: (1) Barrera viva vegetal tri-estrato de 980 metros lineales (Schinus molle en estrato arbóreo, Myrcianthes hallii en estrato arbustivo, y Cymbopogon citratus junto con Aloysia citrodora en estrato herbáceo hipoalergénico); (2) Manejo biológico de bajo impacto mediante conservación de ninfas autóctonas de odonatos en el reservorio léntico y micro-dosificación selectiva de Bacillus thuringiensis israelensis (Bti); y (3) Optimización matemática espacial (SLSQP) alimentada por un catálogo SIG de 259 entidades georreferenciadas. El modelo alcanza una reducción estimada del 82.8% en la tasa de picaduras con una inversión inicial sumamente eficiente de $1,470.00 USD ($1.50/m lineal), integrando riego por goteo por gravedad, compostaje propio y monitoreo telemétrico accesible vía web.</w:t>
         <w:br/>
         <w:br/>
         <w:t>Palabras clave: Simuliidae, Culicoides, Manejo Integrado Ecosistémico, Cercas vivas tri-estrato, Optimización SLSQP, Yachay Tech.</w:t>
@@ -1371,7 +1371,7 @@
           <w:color w:val="333333"/>
           <w:sz w:val="19"/>
         </w:rPr>
-        <w:t>At Yachay Tech University (Urcuquí Valley, Ecuador), the proliferation of biting midges and blackflies (Simulium spp., Culicoides spp., and Lutzomyia spp.) severely affects outdoor habitability across 124 campus structures. To resolve this challenge without synthetic chemical pesticides that threaten regional irrigation networks, Algoritmo Verde engineered an Ecosystem-based Integrated Pest Management framework centered on three components: (1) A 980-meter hypoallergenic 3-strata botanical barrier (Schinus molle, Myrcianthes hallii, and Cymbopogon citratus paired with Aloysia citrodora); (2) Biological conservation leveraging native odonate nymphs in the campus reservoir alongside targeted Bacillus thuringiensis israelensis (Bti) micro-applications; and (3) Non-linear mathematical spatial optimization (SLSQP algorithm) informed by a 257-entity GIS database. The system achieves an estimated 82.8% biting reduction at an extraordinarily cost-effective budget of $1,470.00 USD ($1.50 per linear meter). This solution guarantees environmental safety, long-term bioclimatic resilience, and participatory campus stewardship.</w:t>
+        <w:t>At Yachay Tech University (Urcuquí Valley, Ecuador), the proliferation of biting midges and blackflies (Simulium spp., Culicoides spp., and Lutzomyia spp.) severely affects outdoor habitability across 124 campus structures. To resolve this challenge without synthetic chemical pesticides that threaten regional irrigation networks, Algoritmo Verde engineered an Ecosystem-based Integrated Pest Management framework centered on three components: (1) A 980-meter hypoallergenic 3-strata botanical barrier (Schinus molle, Myrcianthes hallii, and Cymbopogon citratus paired with Aloysia citrodora); (2) Biological conservation leveraging native odonate nymphs in the campus reservoir alongside targeted Bacillus thuringiensis israelensis (Bti) micro-applications; and (3) Non-linear mathematical spatial optimization (SLSQP algorithm) informed by a 259-entity GIS database. The system achieves an estimated 82.8% biting reduction at an extraordinarily cost-effective budget of $1,470.00 USD ($1.50 per linear meter). This solution guarantees environmental safety, long-term bioclimatic resilience, and participatory campus stewardship.</w:t>
         <w:br/>
         <w:br/>
         <w:t>Keywords: Simuliidae, Culicoides, Ecosystem Management, 3-Strata Living Fences, SLSQP Optimization, GIS Campus Map.</w:t>
@@ -9662,7 +9662,7 @@
         </w:rPr>
         <w:t>1. Problema Resuelto: Se diseñó una solución biológica, no invasiva y de alta ingeniería para mitigar el ataque del complejo vectorial de arenillas (Simulium spp., Culicoides spp., Lutzomyia spp.) en el campus de Yachay Tech, protegiendo 124 edificaciones sin verter agroquímicos a los canales de riego.</w:t>
         <w:br/>
-        <w:t>2. Rigor Científico y Tecnológico: La integración del catálogo SIG de 257 entidades georreferenciadas con la optimización espacial SLSQP permitió dimensionar una barrera viva tri-estrato de 980 metros lineales que maximiza la protección humana (82.8% de mitigación estimada) por un presupuesto realista de $1,470.00 USD.</w:t>
+        <w:t>2. Rigor Científico y Tecnológico: La integración del catálogo SIG de 259 entidades georreferenciadas con la optimización espacial SLSQP permitió dimensionar una barrera viva tri-estrato de 980 metros lineales que maximiza la protección humana (82.8% de mitigación estimada) por un presupuesto realista de $1,470.00 USD.</w:t>
         <w:br/>
         <w:t>3. Limitaciones Reconocidas: La barrera arbórea y arbustiva requiere de 6 a 12 meses para su consolidación estructural completa; sin embargo, el estrato basal herbáceo de Hierba Luisa y Cedrón provee repelencia fitoquímica funcional a partir de la tercera semana de siembra.</w:t>
         <w:br/>
@@ -10477,7 +10477,7 @@
                 <w:color w:val="000000"/>
                 <w:sz w:val="17"/>
               </w:rPr>
-              <w:t>Optimización matemática multiobjetivo de trayectorias (algoritmo SLSQP) y renderizado del mapa geoespacial interactivo de 257 entidades.</w:t>
+              <w:t>Optimización matemática multiobjetivo de trayectorias (algoritmo SLSQP) y renderizado del mapa geoespacial interactivo de 259 entidades.</w:t>
             </w:r>
           </w:p>
         </w:tc>
@@ -10815,7 +10815,7 @@
         <w:br/>
         <w:t>1. Visor Geoespacial Interactivo Web (Folium / Leaflet):</w:t>
         <w:br/>
-        <w:t>Plataforma cartográfica interactiva con 257 entidades GIS (124 edificios catalogados, 65 canales y líneas divisorias, 67 puntos de hitos, paradas y parqueos, 12 segmentos de barreras vivas y 6 estaciones de bio-monitoreo GPS). Capa de polígonos patrimoniales no bloqueante para facilitar la navegación:</w:t>
+        <w:t>Plataforma cartográfica interactiva con 259 entidades GIS (124 edificios catalogados, 65 canales y líneas divisorias, 69 puntos de hitos, paradas y parqueos, 12 segmentos de barreras vivas y 6 estaciones de bio-monitoreo GPS). Capa de polígonos patrimoniales no bloqueante para facilitar la navegación:</w:t>
         <w:br/>
         <w:t>Enlace de acceso libre: https://jeffersonconza.github.io/algoritmo-verde-yosw2026/</w:t>
         <w:br/>

</xml_diff>

<commit_message>
fix(gis): remove non-existent Acequia Secundaria Ingenio (258 entities: 69 Points, 125 Polygons, 64 LineStrings)
</commit_message>
<xml_diff>
--- a/WhatsApp Chat with Ideaton/Plantilla Documento Tecnico Reto 3.01_COMPLETO.docx
+++ b/WhatsApp Chat with Ideaton/Plantilla Documento Tecnico Reto 3.01_COMPLETO.docx
@@ -1350,7 +1350,7 @@
           <w:color w:val="333333"/>
           <w:sz w:val="19"/>
         </w:rPr>
-        <w:t>En la Universidad Yachay Tech (valle de Urcuquí), la proliferación diurna del complejo de arenillas hematófagas (Simulium spp., Culicoides spp. y Lutzomyia spp.) genera severas molestias y riesgo sanitario en 124 edificaciones del campus. Para mitigar esta plaga sin recurrir a insecticidas sintéticos que contaminen las acequias de riego del cantón, el equipo Algoritmo Verde formuló una estrategia de Manejo Integrado Ecosistémico estructurada en tres ejes sinérgicos: (1) Barrera viva vegetal tri-estrato de 980 metros lineales (Schinus molle en estrato arbóreo, Myrcianthes hallii en estrato arbustivo, y Cymbopogon citratus junto con Aloysia citrodora en estrato herbáceo hipoalergénico); (2) Manejo biológico de bajo impacto mediante conservación de ninfas autóctonas de odonatos en el reservorio léntico y micro-dosificación selectiva de Bacillus thuringiensis israelensis (Bti); y (3) Optimización matemática espacial (SLSQP) alimentada por un catálogo SIG de 259 entidades georreferenciadas. El modelo alcanza una reducción estimada del 82.8% en la tasa de picaduras con una inversión inicial sumamente eficiente de $1,470.00 USD ($1.50/m lineal), integrando riego por goteo por gravedad, compostaje propio y monitoreo telemétrico accesible vía web.</w:t>
+        <w:t>En la Universidad Yachay Tech (valle de Urcuquí), la proliferación diurna del complejo de arenillas hematófagas (Simulium spp., Culicoides spp. y Lutzomyia spp.) genera severas molestias y riesgo sanitario en 124 edificaciones del campus. Para mitigar esta plaga sin recurrir a insecticidas sintéticos que contaminen las acequias de riego del cantón, el equipo Algoritmo Verde formuló una estrategia de Manejo Integrado Ecosistémico estructurada en tres ejes sinérgicos: (1) Barrera viva vegetal tri-estrato de 980 metros lineales (Schinus molle en estrato arbóreo, Myrcianthes hallii en estrato arbustivo, y Cymbopogon citratus junto con Aloysia citrodora en estrato herbáceo hipoalergénico); (2) Manejo biológico de bajo impacto mediante conservación de ninfas autóctonas de odonatos en el reservorio léntico y micro-dosificación selectiva de Bacillus thuringiensis israelensis (Bti); y (3) Optimización matemática espacial (SLSQP) alimentada por un catálogo SIG de 258 entidades georreferenciadas. El modelo alcanza una reducción estimada del 82.8% en la tasa de picaduras con una inversión inicial sumamente eficiente de $1,470.00 USD ($1.50/m lineal), integrando riego por goteo por gravedad, compostaje propio y monitoreo telemétrico accesible vía web.</w:t>
         <w:br/>
         <w:br/>
         <w:t>Palabras clave: Simuliidae, Culicoides, Manejo Integrado Ecosistémico, Cercas vivas tri-estrato, Optimización SLSQP, Yachay Tech.</w:t>
@@ -1371,7 +1371,7 @@
           <w:color w:val="333333"/>
           <w:sz w:val="19"/>
         </w:rPr>
-        <w:t>At Yachay Tech University (Urcuquí Valley, Ecuador), the proliferation of biting midges and blackflies (Simulium spp., Culicoides spp., and Lutzomyia spp.) severely affects outdoor habitability across 124 campus structures. To resolve this challenge without synthetic chemical pesticides that threaten regional irrigation networks, Algoritmo Verde engineered an Ecosystem-based Integrated Pest Management framework centered on three components: (1) A 980-meter hypoallergenic 3-strata botanical barrier (Schinus molle, Myrcianthes hallii, and Cymbopogon citratus paired with Aloysia citrodora); (2) Biological conservation leveraging native odonate nymphs in the campus reservoir alongside targeted Bacillus thuringiensis israelensis (Bti) micro-applications; and (3) Non-linear mathematical spatial optimization (SLSQP algorithm) informed by a 259-entity GIS database. The system achieves an estimated 82.8% biting reduction at an extraordinarily cost-effective budget of $1,470.00 USD ($1.50 per linear meter). This solution guarantees environmental safety, long-term bioclimatic resilience, and participatory campus stewardship.</w:t>
+        <w:t>At Yachay Tech University (Urcuquí Valley, Ecuador), the proliferation of biting midges and blackflies (Simulium spp., Culicoides spp., and Lutzomyia spp.) severely affects outdoor habitability across 124 campus structures. To resolve this challenge without synthetic chemical pesticides that threaten regional irrigation networks, Algoritmo Verde engineered an Ecosystem-based Integrated Pest Management framework centered on three components: (1) A 980-meter hypoallergenic 3-strata botanical barrier (Schinus molle, Myrcianthes hallii, and Cymbopogon citratus paired with Aloysia citrodora); (2) Biological conservation leveraging native odonate nymphs in the campus reservoir alongside targeted Bacillus thuringiensis israelensis (Bti) micro-applications; and (3) Non-linear mathematical spatial optimization (SLSQP algorithm) informed by a 258-entity GIS database. The system achieves an estimated 82.8% biting reduction at an extraordinarily cost-effective budget of $1,470.00 USD ($1.50 per linear meter). This solution guarantees environmental safety, long-term bioclimatic resilience, and participatory campus stewardship.</w:t>
         <w:br/>
         <w:br/>
         <w:t>Keywords: Simuliidae, Culicoides, Ecosystem Management, 3-Strata Living Fences, SLSQP Optimization, GIS Campus Map.</w:t>
@@ -9662,7 +9662,7 @@
         </w:rPr>
         <w:t>1. Problema Resuelto: Se diseñó una solución biológica, no invasiva y de alta ingeniería para mitigar el ataque del complejo vectorial de arenillas (Simulium spp., Culicoides spp., Lutzomyia spp.) en el campus de Yachay Tech, protegiendo 124 edificaciones sin verter agroquímicos a los canales de riego.</w:t>
         <w:br/>
-        <w:t>2. Rigor Científico y Tecnológico: La integración del catálogo SIG de 259 entidades georreferenciadas con la optimización espacial SLSQP permitió dimensionar una barrera viva tri-estrato de 980 metros lineales que maximiza la protección humana (82.8% de mitigación estimada) por un presupuesto realista de $1,470.00 USD.</w:t>
+        <w:t>2. Rigor Científico y Tecnológico: La integración del catálogo SIG de 258 entidades georreferenciadas con la optimización espacial SLSQP permitió dimensionar una barrera viva tri-estrato de 980 metros lineales que maximiza la protección humana (82.8% de mitigación estimada) por un presupuesto realista de $1,470.00 USD.</w:t>
         <w:br/>
         <w:t>3. Limitaciones Reconocidas: La barrera arbórea y arbustiva requiere de 6 a 12 meses para su consolidación estructural completa; sin embargo, el estrato basal herbáceo de Hierba Luisa y Cedrón provee repelencia fitoquímica funcional a partir de la tercera semana de siembra.</w:t>
         <w:br/>
@@ -10477,7 +10477,7 @@
                 <w:color w:val="000000"/>
                 <w:sz w:val="17"/>
               </w:rPr>
-              <w:t>Optimización matemática multiobjetivo de trayectorias (algoritmo SLSQP) y renderizado del mapa geoespacial interactivo de 259 entidades.</w:t>
+              <w:t>Optimización matemática multiobjetivo de trayectorias (algoritmo SLSQP) y renderizado del mapa geoespacial interactivo de 258 entidades.</w:t>
             </w:r>
           </w:p>
         </w:tc>
@@ -10815,7 +10815,7 @@
         <w:br/>
         <w:t>1. Visor Geoespacial Interactivo Web (Folium / Leaflet):</w:t>
         <w:br/>
-        <w:t>Plataforma cartográfica interactiva con 259 entidades GIS (124 edificios catalogados, 65 canales y líneas divisorias, 69 puntos de hitos, paradas y parqueos, 12 segmentos de barreras vivas y 6 estaciones de bio-monitoreo GPS). Capa de polígonos patrimoniales no bloqueante para facilitar la navegación:</w:t>
+        <w:t>Plataforma cartográfica interactiva con 258 entidades GIS (124 edificios catalogados, 64 canales y líneas divisorias, 69 puntos de hitos, paradas y parqueos, 12 segmentos de barreras vivas y 6 estaciones de bio-monitoreo GPS). Capa de polígonos patrimoniales no bloqueante para facilitar la navegación:</w:t>
         <w:br/>
         <w:t>Enlace de acceso libre: https://jeffersonconza.github.io/algoritmo-verde-yosw2026/</w:t>
         <w:br/>

</xml_diff>

<commit_message>
feat(gis): add 6 campus road corridors LINE-VIA-01..06 (4,214.5 m total; 264 GIS entities: 69 Points, 125 Polygons, 70 LineStrings)
</commit_message>
<xml_diff>
--- a/WhatsApp Chat with Ideaton/Plantilla Documento Tecnico Reto 3.01_COMPLETO.docx
+++ b/WhatsApp Chat with Ideaton/Plantilla Documento Tecnico Reto 3.01_COMPLETO.docx
@@ -1350,7 +1350,7 @@
           <w:color w:val="333333"/>
           <w:sz w:val="19"/>
         </w:rPr>
-        <w:t>En la Universidad Yachay Tech (valle de Urcuquí), la proliferación diurna del complejo de arenillas hematófagas (Simulium spp., Culicoides spp. y Lutzomyia spp.) genera severas molestias y riesgo sanitario en 124 edificaciones del campus. Para mitigar esta plaga sin recurrir a insecticidas sintéticos que contaminen las acequias de riego del cantón, el equipo Algoritmo Verde formuló una estrategia de Manejo Integrado Ecosistémico estructurada en tres ejes sinérgicos: (1) Barrera viva vegetal tri-estrato de 980 metros lineales (Schinus molle en estrato arbóreo, Myrcianthes hallii en estrato arbustivo, y Cymbopogon citratus junto con Aloysia citrodora en estrato herbáceo hipoalergénico); (2) Manejo biológico de bajo impacto mediante conservación de ninfas autóctonas de odonatos en el reservorio léntico y micro-dosificación selectiva de Bacillus thuringiensis israelensis (Bti); y (3) Optimización matemática espacial (SLSQP) alimentada por un catálogo SIG de 258 entidades georreferenciadas. El modelo alcanza una reducción estimada del 82.8% en la tasa de picaduras con una inversión inicial sumamente eficiente de $1,470.00 USD ($1.50/m lineal), integrando riego por goteo por gravedad, compostaje propio y monitoreo telemétrico accesible vía web.</w:t>
+        <w:t>En la Universidad Yachay Tech (valle de Urcuquí), la proliferación diurna del complejo de arenillas hematófagas (Simulium spp., Culicoides spp. y Lutzomyia spp.) genera severas molestias y riesgo sanitario en 124 edificaciones del campus. Para mitigar esta plaga sin recurrir a insecticidas sintéticos que contaminen las acequias de riego del cantón, el equipo Algoritmo Verde formuló una estrategia de Manejo Integrado Ecosistémico estructurada en tres ejes sinérgicos: (1) Barrera viva vegetal tri-estrato de 980 metros lineales (Schinus molle en estrato arbóreo, Myrcianthes hallii en estrato arbustivo, y Cymbopogon citratus junto con Aloysia citrodora en estrato herbáceo hipoalergénico); (2) Manejo biológico de bajo impacto mediante conservación de ninfas autóctonas de odonatos en el reservorio léntico y micro-dosificación selectiva de Bacillus thuringiensis israelensis (Bti); y (3) Optimización matemática espacial (SLSQP) alimentada por un catálogo SIG de 264 entidades georreferenciadas. El modelo alcanza una reducción estimada del 82.8% en la tasa de picaduras con una inversión inicial sumamente eficiente de $1,470.00 USD ($1.50/m lineal), integrando riego por goteo por gravedad, compostaje propio y monitoreo telemétrico accesible vía web.</w:t>
         <w:br/>
         <w:br/>
         <w:t>Palabras clave: Simuliidae, Culicoides, Manejo Integrado Ecosistémico, Cercas vivas tri-estrato, Optimización SLSQP, Yachay Tech.</w:t>
@@ -1371,7 +1371,7 @@
           <w:color w:val="333333"/>
           <w:sz w:val="19"/>
         </w:rPr>
-        <w:t>At Yachay Tech University (Urcuquí Valley, Ecuador), the proliferation of biting midges and blackflies (Simulium spp., Culicoides spp., and Lutzomyia spp.) severely affects outdoor habitability across 124 campus structures. To resolve this challenge without synthetic chemical pesticides that threaten regional irrigation networks, Algoritmo Verde engineered an Ecosystem-based Integrated Pest Management framework centered on three components: (1) A 980-meter hypoallergenic 3-strata botanical barrier (Schinus molle, Myrcianthes hallii, and Cymbopogon citratus paired with Aloysia citrodora); (2) Biological conservation leveraging native odonate nymphs in the campus reservoir alongside targeted Bacillus thuringiensis israelensis (Bti) micro-applications; and (3) Non-linear mathematical spatial optimization (SLSQP algorithm) informed by a 258-entity GIS database. The system achieves an estimated 82.8% biting reduction at an extraordinarily cost-effective budget of $1,470.00 USD ($1.50 per linear meter). This solution guarantees environmental safety, long-term bioclimatic resilience, and participatory campus stewardship.</w:t>
+        <w:t>At Yachay Tech University (Urcuquí Valley, Ecuador), the proliferation of biting midges and blackflies (Simulium spp., Culicoides spp., and Lutzomyia spp.) severely affects outdoor habitability across 124 campus structures. To resolve this challenge without synthetic chemical pesticides that threaten regional irrigation networks, Algoritmo Verde engineered an Ecosystem-based Integrated Pest Management framework centered on three components: (1) A 980-meter hypoallergenic 3-strata botanical barrier (Schinus molle, Myrcianthes hallii, and Cymbopogon citratus paired with Aloysia citrodora); (2) Biological conservation leveraging native odonate nymphs in the campus reservoir alongside targeted Bacillus thuringiensis israelensis (Bti) micro-applications; and (3) Non-linear mathematical spatial optimization (SLSQP algorithm) informed by a 264-entity GIS database. The system achieves an estimated 82.8% biting reduction at an extraordinarily cost-effective budget of $1,470.00 USD ($1.50 per linear meter). This solution guarantees environmental safety, long-term bioclimatic resilience, and participatory campus stewardship.</w:t>
         <w:br/>
         <w:br/>
         <w:t>Keywords: Simuliidae, Culicoides, Ecosystem Management, 3-Strata Living Fences, SLSQP Optimization, GIS Campus Map.</w:t>
@@ -9662,7 +9662,7 @@
         </w:rPr>
         <w:t>1. Problema Resuelto: Se diseñó una solución biológica, no invasiva y de alta ingeniería para mitigar el ataque del complejo vectorial de arenillas (Simulium spp., Culicoides spp., Lutzomyia spp.) en el campus de Yachay Tech, protegiendo 124 edificaciones sin verter agroquímicos a los canales de riego.</w:t>
         <w:br/>
-        <w:t>2. Rigor Científico y Tecnológico: La integración del catálogo SIG de 258 entidades georreferenciadas con la optimización espacial SLSQP permitió dimensionar una barrera viva tri-estrato de 980 metros lineales que maximiza la protección humana (82.8% de mitigación estimada) por un presupuesto realista de $1,470.00 USD.</w:t>
+        <w:t>2. Rigor Científico y Tecnológico: La integración del catálogo SIG de 264 entidades georreferenciadas con la optimización espacial SLSQP permitió dimensionar una barrera viva tri-estrato de 980 metros lineales que maximiza la protección humana (82.8% de mitigación estimada) por un presupuesto realista de $1,470.00 USD.</w:t>
         <w:br/>
         <w:t>3. Limitaciones Reconocidas: La barrera arbórea y arbustiva requiere de 6 a 12 meses para su consolidación estructural completa; sin embargo, el estrato basal herbáceo de Hierba Luisa y Cedrón provee repelencia fitoquímica funcional a partir de la tercera semana de siembra.</w:t>
         <w:br/>
@@ -10477,7 +10477,7 @@
                 <w:color w:val="000000"/>
                 <w:sz w:val="17"/>
               </w:rPr>
-              <w:t>Optimización matemática multiobjetivo de trayectorias (algoritmo SLSQP) y renderizado del mapa geoespacial interactivo de 258 entidades.</w:t>
+              <w:t>Optimización matemática multiobjetivo de trayectorias (algoritmo SLSQP) y renderizado del mapa geoespacial interactivo de 264 entidades.</w:t>
             </w:r>
           </w:p>
         </w:tc>
@@ -10815,7 +10815,7 @@
         <w:br/>
         <w:t>1. Visor Geoespacial Interactivo Web (Folium / Leaflet):</w:t>
         <w:br/>
-        <w:t>Plataforma cartográfica interactiva con 258 entidades GIS (124 edificios catalogados, 64 canales y líneas divisorias, 69 puntos de hitos, paradas y parqueos, 12 segmentos de barreras vivas y 6 estaciones de bio-monitoreo GPS). Capa de polígonos patrimoniales no bloqueante para facilitar la navegación:</w:t>
+        <w:t>Plataforma cartográfica interactiva con 264 entidades GIS (124 edificios catalogados, 70 canales, vías y líneas divisorias, 69 puntos de hitos, paradas y parqueos, 12 segmentos de barreras vivas y 6 estaciones de bio-monitoreo GPS). Capa de polígonos patrimoniales no bloqueante para facilitar la navegación:</w:t>
         <w:br/>
         <w:t>Enlace de acceso libre: https://jeffersonconza.github.io/algoritmo-verde-yosw2026/</w:t>
         <w:br/>

</xml_diff>

<commit_message>
feat(gis): add 10 internal walkways LINE-VIA-07..16 and 12 green areas POLY-VERDE-01..12 with zero building overlap (286 GIS entities)
</commit_message>
<xml_diff>
--- a/WhatsApp Chat with Ideaton/Plantilla Documento Tecnico Reto 3.01_COMPLETO.docx
+++ b/WhatsApp Chat with Ideaton/Plantilla Documento Tecnico Reto 3.01_COMPLETO.docx
@@ -1350,7 +1350,7 @@
           <w:color w:val="333333"/>
           <w:sz w:val="19"/>
         </w:rPr>
-        <w:t>En la Universidad Yachay Tech (valle de Urcuquí), la proliferación diurna del complejo de arenillas hematófagas (Simulium spp., Culicoides spp. y Lutzomyia spp.) genera severas molestias y riesgo sanitario en 124 edificaciones del campus. Para mitigar esta plaga sin recurrir a insecticidas sintéticos que contaminen las acequias de riego del cantón, el equipo Algoritmo Verde formuló una estrategia de Manejo Integrado Ecosistémico estructurada en tres ejes sinérgicos: (1) Barrera viva vegetal tri-estrato de 980 metros lineales (Schinus molle en estrato arbóreo, Myrcianthes hallii en estrato arbustivo, y Cymbopogon citratus junto con Aloysia citrodora en estrato herbáceo hipoalergénico); (2) Manejo biológico de bajo impacto mediante conservación de ninfas autóctonas de odonatos en el reservorio léntico y micro-dosificación selectiva de Bacillus thuringiensis israelensis (Bti); y (3) Optimización matemática espacial (SLSQP) alimentada por un catálogo SIG de 264 entidades georreferenciadas. El modelo alcanza una reducción estimada del 82.8% en la tasa de picaduras con una inversión inicial sumamente eficiente de $1,470.00 USD ($1.50/m lineal), integrando riego por goteo por gravedad, compostaje propio y monitoreo telemétrico accesible vía web.</w:t>
+        <w:t>En la Universidad Yachay Tech (valle de Urcuquí), la proliferación diurna del complejo de arenillas hematófagas (Simulium spp., Culicoides spp. y Lutzomyia spp.) genera severas molestias y riesgo sanitario en 124 edificaciones del campus. Para mitigar esta plaga sin recurrir a insecticidas sintéticos que contaminen las acequias de riego del cantón, el equipo Algoritmo Verde formuló una estrategia de Manejo Integrado Ecosistémico estructurada en tres ejes sinérgicos: (1) Barrera viva vegetal tri-estrato de 980 metros lineales (Schinus molle en estrato arbóreo, Myrcianthes hallii en estrato arbustivo, y Cymbopogon citratus junto con Aloysia citrodora en estrato herbáceo hipoalergénico); (2) Manejo biológico de bajo impacto mediante conservación de ninfas autóctonas de odonatos en el reservorio léntico y micro-dosificación selectiva de Bacillus thuringiensis israelensis (Bti); y (3) Optimización matemática espacial (SLSQP) alimentada por un catálogo SIG de 286 entidades georreferenciadas. El modelo alcanza una reducción estimada del 82.8% en la tasa de picaduras con una inversión inicial sumamente eficiente de $1,470.00 USD ($1.50/m lineal), integrando riego por goteo por gravedad, compostaje propio y monitoreo telemétrico accesible vía web.</w:t>
         <w:br/>
         <w:br/>
         <w:t>Palabras clave: Simuliidae, Culicoides, Manejo Integrado Ecosistémico, Cercas vivas tri-estrato, Optimización SLSQP, Yachay Tech.</w:t>
@@ -1371,7 +1371,7 @@
           <w:color w:val="333333"/>
           <w:sz w:val="19"/>
         </w:rPr>
-        <w:t>At Yachay Tech University (Urcuquí Valley, Ecuador), the proliferation of biting midges and blackflies (Simulium spp., Culicoides spp., and Lutzomyia spp.) severely affects outdoor habitability across 124 campus structures. To resolve this challenge without synthetic chemical pesticides that threaten regional irrigation networks, Algoritmo Verde engineered an Ecosystem-based Integrated Pest Management framework centered on three components: (1) A 980-meter hypoallergenic 3-strata botanical barrier (Schinus molle, Myrcianthes hallii, and Cymbopogon citratus paired with Aloysia citrodora); (2) Biological conservation leveraging native odonate nymphs in the campus reservoir alongside targeted Bacillus thuringiensis israelensis (Bti) micro-applications; and (3) Non-linear mathematical spatial optimization (SLSQP algorithm) informed by a 264-entity GIS database. The system achieves an estimated 82.8% biting reduction at an extraordinarily cost-effective budget of $1,470.00 USD ($1.50 per linear meter). This solution guarantees environmental safety, long-term bioclimatic resilience, and participatory campus stewardship.</w:t>
+        <w:t>At Yachay Tech University (Urcuquí Valley, Ecuador), the proliferation of biting midges and blackflies (Simulium spp., Culicoides spp., and Lutzomyia spp.) severely affects outdoor habitability across 124 campus structures. To resolve this challenge without synthetic chemical pesticides that threaten regional irrigation networks, Algoritmo Verde engineered an Ecosystem-based Integrated Pest Management framework centered on three components: (1) A 980-meter hypoallergenic 3-strata botanical barrier (Schinus molle, Myrcianthes hallii, and Cymbopogon citratus paired with Aloysia citrodora); (2) Biological conservation leveraging native odonate nymphs in the campus reservoir alongside targeted Bacillus thuringiensis israelensis (Bti) micro-applications; and (3) Non-linear mathematical spatial optimization (SLSQP algorithm) informed by a 286-entity GIS database. The system achieves an estimated 82.8% biting reduction at an extraordinarily cost-effective budget of $1,470.00 USD ($1.50 per linear meter). This solution guarantees environmental safety, long-term bioclimatic resilience, and participatory campus stewardship.</w:t>
         <w:br/>
         <w:br/>
         <w:t>Keywords: Simuliidae, Culicoides, Ecosystem Management, 3-Strata Living Fences, SLSQP Optimization, GIS Campus Map.</w:t>
@@ -9662,7 +9662,7 @@
         </w:rPr>
         <w:t>1. Problema Resuelto: Se diseñó una solución biológica, no invasiva y de alta ingeniería para mitigar el ataque del complejo vectorial de arenillas (Simulium spp., Culicoides spp., Lutzomyia spp.) en el campus de Yachay Tech, protegiendo 124 edificaciones sin verter agroquímicos a los canales de riego.</w:t>
         <w:br/>
-        <w:t>2. Rigor Científico y Tecnológico: La integración del catálogo SIG de 264 entidades georreferenciadas con la optimización espacial SLSQP permitió dimensionar una barrera viva tri-estrato de 980 metros lineales que maximiza la protección humana (82.8% de mitigación estimada) por un presupuesto realista de $1,470.00 USD.</w:t>
+        <w:t>2. Rigor Científico y Tecnológico: La integración del catálogo SIG de 286 entidades georreferenciadas con la optimización espacial SLSQP permitió dimensionar una barrera viva tri-estrato de 980 metros lineales que maximiza la protección humana (82.8% de mitigación estimada) por un presupuesto realista de $1,470.00 USD.</w:t>
         <w:br/>
         <w:t>3. Limitaciones Reconocidas: La barrera arbórea y arbustiva requiere de 6 a 12 meses para su consolidación estructural completa; sin embargo, el estrato basal herbáceo de Hierba Luisa y Cedrón provee repelencia fitoquímica funcional a partir de la tercera semana de siembra.</w:t>
         <w:br/>
@@ -10477,7 +10477,7 @@
                 <w:color w:val="000000"/>
                 <w:sz w:val="17"/>
               </w:rPr>
-              <w:t>Optimización matemática multiobjetivo de trayectorias (algoritmo SLSQP) y renderizado del mapa geoespacial interactivo de 264 entidades.</w:t>
+              <w:t>Optimización matemática multiobjetivo de trayectorias (algoritmo SLSQP) y renderizado del mapa geoespacial interactivo de 286 entidades.</w:t>
             </w:r>
           </w:p>
         </w:tc>
@@ -10815,7 +10815,7 @@
         <w:br/>
         <w:t>1. Visor Geoespacial Interactivo Web (Folium / Leaflet):</w:t>
         <w:br/>
-        <w:t>Plataforma cartográfica interactiva con 264 entidades GIS (124 edificios catalogados, 70 canales, vías y líneas divisorias, 69 puntos de hitos, paradas y parqueos, 12 segmentos de barreras vivas y 6 estaciones de bio-monitoreo GPS). Capa de polígonos patrimoniales no bloqueante para facilitar la navegación:</w:t>
+        <w:t>Plataforma cartográfica interactiva con 286 entidades GIS (124 edificios catalogados, 12 áreas verdes/jardines, 80 canales, vías, caminerías y líneas divisorias, 69 puntos de hitos, paradas y parqueos, 12 segmentos de barreras vivas y 6 estaciones de bio-monitoreo GPS). Capa de polígonos patrimoniales no bloqueante para facilitar la navegación:</w:t>
         <w:br/>
         <w:t>Enlace de acceso libre: https://jeffersonconza.github.io/algoritmo-verde-yosw2026/</w:t>
         <w:br/>

</xml_diff>